<commit_message>
Modifications to close issue #5
</commit_message>
<xml_diff>
--- a/lspb-64-bits/LSPB UM.docx
+++ b/lspb-64-bits/LSPB UM.docx
@@ -4899,19 +4899,11 @@
           <w:lang w:val="en-US"/>
         </w:rPr>
       </w:pPr>
-      <w:proofErr w:type="gramStart"/>
-      <w:r>
-        <w:rPr>
-          <w:lang w:val="en-US"/>
-        </w:rPr>
-        <w:t>java</w:t>
-      </w:r>
-      <w:proofErr w:type="gramEnd"/>
-      <w:r>
-        <w:rPr>
-          <w:lang w:val="en-US"/>
-        </w:rPr>
-        <w:t xml:space="preserve"> -d64 –version</w:t>
+      <w:r>
+        <w:rPr>
+          <w:lang w:val="en-US"/>
+        </w:rPr>
+        <w:t>java -d64 –version</w:t>
       </w:r>
     </w:p>
     <w:p>
@@ -5330,19 +5322,11 @@
         </w:rPr>
         <w:tab/>
       </w:r>
-      <w:proofErr w:type="spellStart"/>
-      <w:r>
-        <w:rPr>
-          <w:lang w:val="en-US"/>
-        </w:rPr>
-        <w:t>eXtended</w:t>
-      </w:r>
-      <w:proofErr w:type="spellEnd"/>
-      <w:r>
-        <w:rPr>
-          <w:lang w:val="en-US"/>
-        </w:rPr>
-        <w:t xml:space="preserve"> Markup Language</w:t>
+      <w:r>
+        <w:rPr>
+          <w:lang w:val="en-US"/>
+        </w:rPr>
+        <w:t>eXtended Markup Language</w:t>
       </w:r>
     </w:p>
     <w:p>
@@ -5603,27 +5587,13 @@
         <w:rPr>
           <w:lang w:val="en-US"/>
         </w:rPr>
-        <w:t xml:space="preserve">tic generation process, like </w:t>
-      </w:r>
-      <w:proofErr w:type="spellStart"/>
-      <w:r>
-        <w:rPr>
-          <w:lang w:val="en-US"/>
-        </w:rPr>
-        <w:t>ma</w:t>
-      </w:r>
-      <w:r>
-        <w:rPr>
-          <w:lang w:val="en-US"/>
-        </w:rPr>
-        <w:t>kefile</w:t>
-      </w:r>
-      <w:proofErr w:type="spellEnd"/>
-      <w:r>
-        <w:rPr>
-          <w:lang w:val="en-US"/>
-        </w:rPr>
-        <w:t>. Options are used to tune the generation process.</w:t>
+        <w:t>tic generation process, like ma</w:t>
+      </w:r>
+      <w:r>
+        <w:rPr>
+          <w:lang w:val="en-US"/>
+        </w:rPr>
+        <w:t>kefile. Options are used to tune the generation process.</w:t>
       </w:r>
     </w:p>
     <w:p>
@@ -5657,13 +5627,8 @@
       <w:bookmarkEnd w:id="25"/>
     </w:p>
     <w:p>
-      <w:proofErr w:type="gramStart"/>
-      <w:r>
-        <w:t>java</w:t>
-      </w:r>
-      <w:proofErr w:type="gramEnd"/>
-      <w:r>
-        <w:t xml:space="preserve"> –jar LSPB.jar &lt;XML configuration file&gt;</w:t>
+      <w:r>
+        <w:t>java –jar LSPB.jar &lt;XML configuration file&gt;</w:t>
       </w:r>
     </w:p>
     <w:p/>
@@ -5934,14 +5899,9 @@
         <w:pStyle w:val="Titre3"/>
       </w:pPr>
       <w:r>
-        <w:t xml:space="preserve">Main </w:t>
-      </w:r>
-      <w:proofErr w:type="spellStart"/>
-      <w:r>
-        <w:t>window</w:t>
+        <w:t>Main window</w:t>
       </w:r>
       <w:bookmarkEnd w:id="27"/>
-      <w:proofErr w:type="spellEnd"/>
     </w:p>
     <w:p>
       <w:pPr>
@@ -6601,7 +6561,7 @@
           <v:shape id="_x0000_i1025" type="#_x0000_t75" style="width:77pt;height:50pt" o:ole="">
             <v:imagedata r:id="rId14" o:title=""/>
           </v:shape>
-          <o:OLEObject Type="Embed" ProgID="Package" ShapeID="_x0000_i1025" DrawAspect="Icon" ObjectID="_1847127466" r:id="rId15"/>
+          <o:OLEObject Type="Embed" ProgID="Package" ShapeID="_x0000_i1025" DrawAspect="Icon" ObjectID="_1847173658" r:id="rId15"/>
         </w:object>
       </w:r>
     </w:p>
@@ -6611,40 +6571,24 @@
           <w:lang w:val="en-US"/>
         </w:rPr>
       </w:pPr>
-      <w:proofErr w:type="gramStart"/>
-      <w:r>
-        <w:rPr>
-          <w:lang w:val="en-US"/>
-        </w:rPr>
-        <w:t>&lt;?xml</w:t>
-      </w:r>
-      <w:proofErr w:type="gramEnd"/>
-      <w:r>
-        <w:rPr>
-          <w:lang w:val="en-US"/>
-        </w:rPr>
-        <w:t xml:space="preserve"> version="1.0" encoding="iso-8859-1" standalone="no" ?&gt;</w:t>
-      </w:r>
-    </w:p>
-    <w:p>
-      <w:pPr>
-        <w:rPr>
-          <w:lang w:val="en-US"/>
-        </w:rPr>
-      </w:pPr>
-      <w:proofErr w:type="gramStart"/>
-      <w:r>
-        <w:rPr>
-          <w:lang w:val="en-US"/>
-        </w:rPr>
-        <w:t>&lt;!DOCTYPE</w:t>
-      </w:r>
-      <w:proofErr w:type="gramEnd"/>
-      <w:r>
-        <w:rPr>
-          <w:lang w:val="en-US"/>
-        </w:rPr>
-        <w:t xml:space="preserve"> ARINC665_CONFIGURATION_FILE SYSTEM "LSPB.dtd"&gt;</w:t>
+      <w:r>
+        <w:rPr>
+          <w:lang w:val="en-US"/>
+        </w:rPr>
+        <w:t>&lt;?xml version="1.0" encoding="iso-8859-1" standalone="no" ?&gt;</w:t>
+      </w:r>
+    </w:p>
+    <w:p>
+      <w:pPr>
+        <w:rPr>
+          <w:lang w:val="en-US"/>
+        </w:rPr>
+      </w:pPr>
+      <w:r>
+        <w:rPr>
+          <w:lang w:val="en-US"/>
+        </w:rPr>
+        <w:t>&lt;!DOCTYPE ARINC665_CONFIGURATION_FILE SYSTEM "LSPB.dtd"&gt;</w:t>
       </w:r>
     </w:p>
     <w:p>
@@ -6936,14 +6880,136 @@
         </w:rPr>
         <w:t xml:space="preserve">LOAD </w:t>
       </w:r>
-      <w:proofErr w:type="spellStart"/>
+      <w:r>
+        <w:rPr>
+          <w:lang w:val="en-US"/>
+        </w:rPr>
+        <w:t>integrity_check="X</w:t>
+      </w:r>
+      <w:r>
+        <w:rPr>
+          <w:lang w:val="en-US"/>
+        </w:rPr>
+        <w:t>"&gt;</w:t>
+      </w:r>
+    </w:p>
+    <w:p>
+      <w:pPr>
+        <w:rPr>
+          <w:lang w:val="en-US"/>
+        </w:rPr>
+      </w:pPr>
+      <w:r>
+        <w:rPr>
+          <w:lang w:val="en-US"/>
+        </w:rPr>
+        <w:t xml:space="preserve">    </w:t>
+      </w:r>
+      <w:r>
+        <w:rPr>
+          <w:lang w:val="en-US"/>
+        </w:rPr>
+        <w:t xml:space="preserve">    &lt;</w:t>
+      </w:r>
+      <w:r>
+        <w:rPr>
+          <w:color w:val="FFC000"/>
+          <w:lang w:val="en-US"/>
+        </w:rPr>
+        <w:t>BATCH</w:t>
+      </w:r>
+      <w:r>
+        <w:rPr>
+          <w:lang w:val="en-US"/>
+        </w:rPr>
+        <w:t>&gt;</w:t>
+      </w:r>
+      <w:r>
+        <w:rPr>
+          <w:lang w:val="en-US"/>
+        </w:rPr>
+        <w:t>X</w:t>
+      </w:r>
+      <w:r>
+        <w:rPr>
+          <w:lang w:val="en-US"/>
+        </w:rPr>
+        <w:t>&lt;/</w:t>
+      </w:r>
+      <w:r>
+        <w:rPr>
+          <w:color w:val="FFC000"/>
+          <w:lang w:val="en-US"/>
+        </w:rPr>
+        <w:t>BATCH</w:t>
+      </w:r>
+      <w:r>
+        <w:rPr>
+          <w:lang w:val="en-US"/>
+        </w:rPr>
+        <w:t>&gt;</w:t>
+      </w:r>
+    </w:p>
+    <w:p>
+      <w:r>
+        <w:rPr>
+          <w:lang w:val="en-US"/>
+        </w:rPr>
+        <w:t xml:space="preserve">        </w:t>
+      </w:r>
+      <w:r>
+        <w:t>&lt;</w:t>
+      </w:r>
+      <w:r>
+        <w:rPr>
+          <w:color w:val="7030A0"/>
+        </w:rPr>
+        <w:t xml:space="preserve">TYPE_DESCRIPTION </w:t>
+      </w:r>
+      <w:r>
+        <w:t>id="X"&gt;X&lt;/</w:t>
+      </w:r>
+      <w:r>
+        <w:rPr>
+          <w:color w:val="7030A0"/>
+        </w:rPr>
+        <w:t>TYPE_DESCRIPTION</w:t>
+      </w:r>
+      <w:r>
+        <w:t>&gt;</w:t>
+      </w:r>
+    </w:p>
+    <w:p>
+      <w:pPr>
+        <w:rPr>
+          <w:lang w:val="en-US"/>
+        </w:rPr>
+      </w:pPr>
+      <w:r>
+        <w:t xml:space="preserve">    </w:t>
+      </w:r>
+      <w:r>
+        <w:t xml:space="preserve">    </w:t>
+      </w:r>
+      <w:r>
+        <w:rPr>
+          <w:lang w:val="en-US"/>
+        </w:rPr>
+        <w:t>&lt;</w:t>
+      </w:r>
+      <w:r>
+        <w:rPr>
+          <w:color w:val="FF0000"/>
+          <w:lang w:val="en-US"/>
+        </w:rPr>
+        <w:t xml:space="preserve">INPUT_FILE </w:t>
+      </w:r>
       <w:r>
         <w:rPr>
           <w:lang w:val="en-US"/>
         </w:rPr>
         <w:t>integrity_check</w:t>
       </w:r>
-      <w:proofErr w:type="spellEnd"/>
       <w:r>
         <w:rPr>
           <w:lang w:val="en-US"/>
@@ -6954,7 +7020,44 @@
         <w:rPr>
           <w:lang w:val="en-US"/>
         </w:rPr>
-        <w:t>"&gt;</w:t>
+        <w:t>" padding="</w:t>
+      </w:r>
+      <w:r>
+        <w:rPr>
+          <w:lang w:val="en-US"/>
+        </w:rPr>
+        <w:t>X"</w:t>
+      </w:r>
+      <w:r>
+        <w:rPr>
+          <w:lang w:val="en-US"/>
+        </w:rPr>
+        <w:t>&gt;</w:t>
+      </w:r>
+      <w:r>
+        <w:rPr>
+          <w:lang w:val="en-US"/>
+        </w:rPr>
+        <w:t>X</w:t>
+      </w:r>
+      <w:r>
+        <w:rPr>
+          <w:lang w:val="en-US"/>
+        </w:rPr>
+        <w:t>&lt;/</w:t>
+      </w:r>
+      <w:r>
+        <w:rPr>
+          <w:color w:val="FF0000"/>
+          <w:lang w:val="en-US"/>
+        </w:rPr>
+        <w:t>INPUT_FILE</w:t>
+      </w:r>
+      <w:r>
+        <w:rPr>
+          <w:lang w:val="en-US"/>
+        </w:rPr>
+        <w:t>&gt;</w:t>
       </w:r>
     </w:p>
     <w:p>
@@ -6980,7 +7083,7 @@
           <w:color w:val="FFC000"/>
           <w:lang w:val="en-US"/>
         </w:rPr>
-        <w:t>BATCH</w:t>
+        <w:t>SPLIT_SIZE</w:t>
       </w:r>
       <w:r>
         <w:rPr>
@@ -7005,7 +7108,7 @@
           <w:color w:val="FFC000"/>
           <w:lang w:val="en-US"/>
         </w:rPr>
-        <w:t>BATCH</w:t>
+        <w:t>SPLIT_SIZE</w:t>
       </w:r>
       <w:r>
         <w:rPr>
@@ -7015,269 +7118,92 @@
       </w:r>
     </w:p>
     <w:p>
-      <w:r>
-        <w:rPr>
-          <w:lang w:val="en-US"/>
-        </w:rPr>
-        <w:t xml:space="preserve">        </w:t>
-      </w:r>
-      <w:r>
-        <w:t>&lt;</w:t>
+      <w:pPr>
+        <w:rPr>
+          <w:lang w:val="en-US"/>
+        </w:rPr>
+      </w:pPr>
+      <w:r>
+        <w:rPr>
+          <w:lang w:val="en-US"/>
+        </w:rPr>
+        <w:t xml:space="preserve">    </w:t>
+      </w:r>
+      <w:r>
+        <w:rPr>
+          <w:lang w:val="en-US"/>
+        </w:rPr>
+        <w:t xml:space="preserve">    &lt;</w:t>
+      </w:r>
+      <w:r>
+        <w:rPr>
+          <w:color w:val="92D050"/>
+          <w:lang w:val="en-US"/>
+        </w:rPr>
+        <w:t>DIRECTORY</w:t>
+      </w:r>
+      <w:r>
+        <w:rPr>
+          <w:lang w:val="en-US"/>
+        </w:rPr>
+        <w:t>&gt;</w:t>
+      </w:r>
+      <w:r>
+        <w:rPr>
+          <w:lang w:val="en-US"/>
+        </w:rPr>
+        <w:t>X</w:t>
+      </w:r>
+      <w:r>
+        <w:rPr>
+          <w:lang w:val="en-US"/>
+        </w:rPr>
+        <w:t>&lt;/</w:t>
+      </w:r>
+      <w:r>
+        <w:rPr>
+          <w:color w:val="92D050"/>
+          <w:lang w:val="en-US"/>
+        </w:rPr>
+        <w:t>DIRECTORY</w:t>
+      </w:r>
+      <w:r>
+        <w:rPr>
+          <w:lang w:val="en-US"/>
+        </w:rPr>
+        <w:t>&gt;</w:t>
+      </w:r>
+    </w:p>
+    <w:p>
+      <w:pPr>
+        <w:rPr>
+          <w:lang w:val="en-US"/>
+        </w:rPr>
+      </w:pPr>
+      <w:r>
+        <w:rPr>
+          <w:lang w:val="en-US"/>
+        </w:rPr>
+        <w:t xml:space="preserve">    </w:t>
+      </w:r>
+      <w:r>
+        <w:rPr>
+          <w:lang w:val="en-US"/>
+        </w:rPr>
+        <w:t xml:space="preserve">    &lt;</w:t>
       </w:r>
       <w:r>
         <w:rPr>
           <w:color w:val="7030A0"/>
-        </w:rPr>
-        <w:t xml:space="preserve">TYPE_DESCRIPTION </w:t>
-      </w:r>
-      <w:r>
-        <w:t>id="X"&gt;X&lt;/</w:t>
-      </w:r>
-      <w:r>
-        <w:rPr>
-          <w:color w:val="7030A0"/>
-        </w:rPr>
-        <w:t>TYPE_DESCRIPTION</w:t>
-      </w:r>
-      <w:r>
-        <w:t>&gt;</w:t>
-      </w:r>
-    </w:p>
-    <w:p>
-      <w:pPr>
-        <w:rPr>
-          <w:lang w:val="en-US"/>
-        </w:rPr>
-      </w:pPr>
-      <w:r>
-        <w:t xml:space="preserve">    </w:t>
-      </w:r>
-      <w:r>
-        <w:t xml:space="preserve">    </w:t>
-      </w:r>
-      <w:r>
-        <w:rPr>
-          <w:lang w:val="en-US"/>
-        </w:rPr>
-        <w:t>&lt;</w:t>
-      </w:r>
-      <w:r>
-        <w:rPr>
-          <w:color w:val="FF0000"/>
-          <w:lang w:val="en-US"/>
-        </w:rPr>
-        <w:t xml:space="preserve">INPUT_FILE </w:t>
-      </w:r>
-      <w:proofErr w:type="spellStart"/>
-      <w:r>
-        <w:rPr>
-          <w:lang w:val="en-US"/>
-        </w:rPr>
-        <w:t>integrity_check</w:t>
-      </w:r>
-      <w:proofErr w:type="spellEnd"/>
-      <w:r>
-        <w:rPr>
-          <w:lang w:val="en-US"/>
-        </w:rPr>
-        <w:t>="X</w:t>
-      </w:r>
-      <w:r>
-        <w:rPr>
-          <w:lang w:val="en-US"/>
-        </w:rPr>
-        <w:t>" padding="</w:t>
-      </w:r>
-      <w:r>
-        <w:rPr>
-          <w:lang w:val="en-US"/>
-        </w:rPr>
-        <w:t>X"</w:t>
-      </w:r>
-      <w:r>
-        <w:rPr>
-          <w:lang w:val="en-US"/>
-        </w:rPr>
-        <w:t>&gt;</w:t>
-      </w:r>
-      <w:r>
-        <w:rPr>
-          <w:lang w:val="en-US"/>
-        </w:rPr>
-        <w:t>X</w:t>
-      </w:r>
-      <w:r>
-        <w:rPr>
-          <w:lang w:val="en-US"/>
-        </w:rPr>
-        <w:t>&lt;/</w:t>
-      </w:r>
-      <w:r>
-        <w:rPr>
-          <w:color w:val="FF0000"/>
-          <w:lang w:val="en-US"/>
-        </w:rPr>
-        <w:t>INPUT_FILE</w:t>
-      </w:r>
-      <w:r>
-        <w:rPr>
-          <w:lang w:val="en-US"/>
-        </w:rPr>
-        <w:t>&gt;</w:t>
-      </w:r>
-    </w:p>
-    <w:p>
-      <w:pPr>
-        <w:rPr>
-          <w:lang w:val="en-US"/>
-        </w:rPr>
-      </w:pPr>
-      <w:r>
-        <w:rPr>
-          <w:lang w:val="en-US"/>
-        </w:rPr>
-        <w:t xml:space="preserve">    </w:t>
-      </w:r>
-      <w:r>
-        <w:rPr>
-          <w:lang w:val="en-US"/>
-        </w:rPr>
-        <w:t xml:space="preserve">    &lt;</w:t>
-      </w:r>
-      <w:r>
-        <w:rPr>
-          <w:color w:val="FFC000"/>
-          <w:lang w:val="en-US"/>
-        </w:rPr>
-        <w:t>SPLIT_SIZE</w:t>
-      </w:r>
-      <w:r>
-        <w:rPr>
-          <w:lang w:val="en-US"/>
-        </w:rPr>
-        <w:t>&gt;</w:t>
-      </w:r>
-      <w:r>
-        <w:rPr>
-          <w:lang w:val="en-US"/>
-        </w:rPr>
-        <w:t>X</w:t>
-      </w:r>
-      <w:r>
-        <w:rPr>
-          <w:lang w:val="en-US"/>
-        </w:rPr>
-        <w:t>&lt;/</w:t>
-      </w:r>
-      <w:r>
-        <w:rPr>
-          <w:color w:val="FFC000"/>
-          <w:lang w:val="en-US"/>
-        </w:rPr>
-        <w:t>SPLIT_SIZE</w:t>
-      </w:r>
-      <w:r>
-        <w:rPr>
-          <w:lang w:val="en-US"/>
-        </w:rPr>
-        <w:t>&gt;</w:t>
-      </w:r>
-    </w:p>
-    <w:p>
-      <w:pPr>
-        <w:rPr>
-          <w:lang w:val="en-US"/>
-        </w:rPr>
-      </w:pPr>
-      <w:r>
-        <w:rPr>
-          <w:lang w:val="en-US"/>
-        </w:rPr>
-        <w:t xml:space="preserve">    </w:t>
-      </w:r>
-      <w:r>
-        <w:rPr>
-          <w:lang w:val="en-US"/>
-        </w:rPr>
-        <w:t xml:space="preserve">    &lt;</w:t>
-      </w:r>
-      <w:r>
-        <w:rPr>
-          <w:color w:val="92D050"/>
-          <w:lang w:val="en-US"/>
-        </w:rPr>
-        <w:t>DIRECTORY</w:t>
-      </w:r>
-      <w:r>
-        <w:rPr>
-          <w:lang w:val="en-US"/>
-        </w:rPr>
-        <w:t>&gt;</w:t>
-      </w:r>
-      <w:r>
-        <w:rPr>
-          <w:lang w:val="en-US"/>
-        </w:rPr>
-        <w:t>X</w:t>
-      </w:r>
-      <w:r>
-        <w:rPr>
-          <w:lang w:val="en-US"/>
-        </w:rPr>
-        <w:t>&lt;/</w:t>
-      </w:r>
-      <w:r>
-        <w:rPr>
-          <w:color w:val="92D050"/>
-          <w:lang w:val="en-US"/>
-        </w:rPr>
-        <w:t>DIRECTORY</w:t>
-      </w:r>
-      <w:r>
-        <w:rPr>
-          <w:lang w:val="en-US"/>
-        </w:rPr>
-        <w:t>&gt;</w:t>
-      </w:r>
-    </w:p>
-    <w:p>
-      <w:pPr>
-        <w:rPr>
-          <w:lang w:val="en-US"/>
-        </w:rPr>
-      </w:pPr>
-      <w:r>
-        <w:rPr>
-          <w:lang w:val="en-US"/>
-        </w:rPr>
-        <w:t xml:space="preserve">    </w:t>
-      </w:r>
-      <w:r>
-        <w:rPr>
-          <w:lang w:val="en-US"/>
-        </w:rPr>
-        <w:t xml:space="preserve">    &lt;</w:t>
-      </w:r>
-      <w:r>
-        <w:rPr>
-          <w:color w:val="7030A0"/>
           <w:lang w:val="en-US"/>
         </w:rPr>
         <w:t xml:space="preserve">SUPPORT_FILE_LIST </w:t>
       </w:r>
-      <w:proofErr w:type="spellStart"/>
-      <w:r>
-        <w:rPr>
-          <w:lang w:val="en-US"/>
-        </w:rPr>
-        <w:t>integrity_check</w:t>
-      </w:r>
-      <w:proofErr w:type="spellEnd"/>
-      <w:r>
-        <w:rPr>
-          <w:lang w:val="en-US"/>
-        </w:rPr>
-        <w:t>="</w:t>
+      <w:r>
+        <w:rPr>
+          <w:lang w:val="en-US"/>
+        </w:rPr>
+        <w:t>integrity_check="</w:t>
       </w:r>
       <w:r>
         <w:rPr>
@@ -8318,7 +8244,6 @@
                 <w:lang w:val="en-US"/>
               </w:rPr>
             </w:pPr>
-            <w:proofErr w:type="spellStart"/>
             <w:r>
               <w:rPr>
                 <w:sz w:val="18"/>
@@ -8326,7 +8251,6 @@
               </w:rPr>
               <w:t>integrity_check</w:t>
             </w:r>
-            <w:proofErr w:type="spellEnd"/>
           </w:p>
         </w:tc>
         <w:tc>
@@ -8581,21 +8505,12 @@
                 <w:lang w:val="en-US"/>
               </w:rPr>
             </w:pPr>
-            <w:proofErr w:type="spellStart"/>
             <w:r>
               <w:rPr>
                 <w:sz w:val="18"/>
                 <w:lang w:val="en-US"/>
               </w:rPr>
-              <w:t>integrity_check</w:t>
-            </w:r>
-            <w:proofErr w:type="spellEnd"/>
-            <w:r>
-              <w:rPr>
-                <w:sz w:val="18"/>
-                <w:lang w:val="en-US"/>
-              </w:rPr>
-              <w:t>, padding</w:t>
+              <w:t>integrity_check, padding</w:t>
             </w:r>
           </w:p>
         </w:tc>
@@ -8813,21 +8728,12 @@
                 <w:lang w:val="en-US"/>
               </w:rPr>
             </w:pPr>
-            <w:proofErr w:type="spellStart"/>
             <w:r>
               <w:rPr>
                 <w:sz w:val="18"/>
                 <w:lang w:val="en-US"/>
               </w:rPr>
-              <w:t>integrity_check</w:t>
-            </w:r>
-            <w:proofErr w:type="spellEnd"/>
-            <w:r>
-              <w:rPr>
-                <w:sz w:val="18"/>
-                <w:lang w:val="en-US"/>
-              </w:rPr>
-              <w:t>, number</w:t>
+              <w:t>integrity_check, number</w:t>
             </w:r>
           </w:p>
         </w:tc>
@@ -10016,7 +9922,6 @@
               </w:rPr>
             </w:rPrChange>
           </w:rPr>
-          <w:lastRenderedPageBreak/>
           <w:t>URQT_</w:t>
         </w:r>
       </w:ins>
@@ -10095,6 +10000,7 @@
         <w:rPr>
           <w:lang w:val="en-US"/>
         </w:rPr>
+        <w:lastRenderedPageBreak/>
         <w:t>NO : no files will be generated</w:t>
       </w:r>
     </w:p>
@@ -10675,19 +10581,11 @@
         </w:rPr>
         <w:t xml:space="preserve">The attribute </w:t>
       </w:r>
-      <w:proofErr w:type="spellStart"/>
-      <w:r>
-        <w:rPr>
-          <w:lang w:val="en-US"/>
-        </w:rPr>
-        <w:t>integrity_check</w:t>
-      </w:r>
-      <w:proofErr w:type="spellEnd"/>
-      <w:r>
-        <w:rPr>
-          <w:lang w:val="en-US"/>
-        </w:rPr>
-        <w:t xml:space="preserve"> </w:t>
+      <w:r>
+        <w:rPr>
+          <w:lang w:val="en-US"/>
+        </w:rPr>
+        <w:t xml:space="preserve">integrity_check </w:t>
       </w:r>
       <w:r>
         <w:rPr>
@@ -10861,21 +10759,7 @@
         <w:rPr>
           <w:lang w:val="en-US"/>
         </w:rPr>
-        <w:t xml:space="preserve">&lt;LOAD </w:t>
-      </w:r>
-      <w:proofErr w:type="spellStart"/>
-      <w:r>
-        <w:rPr>
-          <w:lang w:val="en-US"/>
-        </w:rPr>
-        <w:t>integrity_check</w:t>
-      </w:r>
-      <w:proofErr w:type="spellEnd"/>
-      <w:r>
-        <w:rPr>
-          <w:lang w:val="en-US"/>
-        </w:rPr>
-        <w:t>=”MD5”&gt;…&lt;/LOAD&gt;</w:t>
+        <w:t>&lt;LOAD integrity_check=”MD5”&gt;…&lt;/LOAD&gt;</w:t>
       </w:r>
     </w:p>
     <w:p>
@@ -11136,7 +11020,6 @@
           <w:u w:val="single"/>
           <w:lang w:val="en-US"/>
         </w:rPr>
-        <w:lastRenderedPageBreak/>
         <w:t>Example</w:t>
       </w:r>
       <w:r>
@@ -11206,6 +11089,7 @@
         <w:rPr>
           <w:lang w:val="en-US"/>
         </w:rPr>
+        <w:lastRenderedPageBreak/>
         <w:t>This tag is used to indicate the load type description (see ref [3] §</w:t>
       </w:r>
       <w:r>
@@ -11460,14 +11344,12 @@
       </w:pPr>
     </w:p>
     <w:p>
-      <w:proofErr w:type="spellStart"/>
       <w:r>
         <w:rPr>
           <w:u w:val="single"/>
         </w:rPr>
         <w:t>Example</w:t>
       </w:r>
-      <w:proofErr w:type="spellEnd"/>
       <w:r>
         <w:t>:</w:t>
       </w:r>
@@ -11667,19 +11549,11 @@
         </w:rPr>
         <w:t xml:space="preserve">The attribute </w:t>
       </w:r>
-      <w:proofErr w:type="spellStart"/>
-      <w:r>
-        <w:rPr>
-          <w:lang w:val="en-US"/>
-        </w:rPr>
-        <w:t>integrity_check</w:t>
-      </w:r>
-      <w:proofErr w:type="spellEnd"/>
-      <w:r>
-        <w:rPr>
-          <w:lang w:val="en-US"/>
-        </w:rPr>
-        <w:t xml:space="preserve"> </w:t>
+      <w:r>
+        <w:rPr>
+          <w:lang w:val="en-US"/>
+        </w:rPr>
+        <w:t xml:space="preserve">integrity_check </w:t>
       </w:r>
       <w:r>
         <w:rPr>
@@ -11852,7 +11726,31 @@
         <w:rPr>
           <w:lang w:val="en-US"/>
         </w:rPr>
-        <w:t>he content is a list of numbers. The possible values are from 0</w:t>
+        <w:t xml:space="preserve">he content </w:t>
+      </w:r>
+      <w:ins w:id="132" w:author="Pascal Heude" w:date="2026-08-02T11:01:00Z">
+        <w:r>
+          <w:rPr>
+            <w:lang w:val="en-US"/>
+          </w:rPr>
+          <w:t>shall be</w:t>
+        </w:r>
+      </w:ins>
+      <w:bookmarkStart w:id="133" w:name="_GoBack"/>
+      <w:bookmarkEnd w:id="133"/>
+      <w:del w:id="134" w:author="Pascal Heude" w:date="2026-08-02T11:01:00Z">
+        <w:r>
+          <w:rPr>
+            <w:lang w:val="en-US"/>
+          </w:rPr>
+          <w:delText>is</w:delText>
+        </w:r>
+      </w:del>
+      <w:r>
+        <w:rPr>
+          <w:lang w:val="en-US"/>
+        </w:rPr>
+        <w:t xml:space="preserve"> a list of numbers. The possible values are from 0</w:t>
       </w:r>
       <w:r>
         <w:rPr>
@@ -11945,21 +11843,7 @@
         <w:rPr>
           <w:lang w:val="en-US"/>
         </w:rPr>
-        <w:t xml:space="preserve">&lt;INPUT_FILE </w:t>
-      </w:r>
-      <w:proofErr w:type="spellStart"/>
-      <w:r>
-        <w:rPr>
-          <w:lang w:val="en-US"/>
-        </w:rPr>
-        <w:t>integrity_check</w:t>
-      </w:r>
-      <w:proofErr w:type="spellEnd"/>
-      <w:r>
-        <w:rPr>
-          <w:lang w:val="en-US"/>
-        </w:rPr>
-        <w:t>=”SHA-1” padding=”10”&gt;temp\a.exe&lt;/INPUT_FILE&gt;</w:t>
+        <w:t>&lt;INPUT_FILE integrity_check=”SHA-1” padding=”10”&gt;temp\a.exe&lt;/INPUT_FILE&gt;</w:t>
       </w:r>
       <w:r>
         <w:rPr>
@@ -11980,9 +11864,9 @@
       <w:pPr>
         <w:pStyle w:val="Titre3"/>
       </w:pPr>
-      <w:bookmarkStart w:id="132" w:name="_Tag_SPLIT_SIZE"/>
-      <w:bookmarkStart w:id="133" w:name="_Toc456106026"/>
-      <w:bookmarkEnd w:id="132"/>
+      <w:bookmarkStart w:id="135" w:name="_Tag_SPLIT_SIZE"/>
+      <w:bookmarkStart w:id="136" w:name="_Toc456106026"/>
+      <w:bookmarkEnd w:id="135"/>
       <w:r>
         <w:rPr>
           <w:lang w:val="en-US"/>
@@ -11992,7 +11876,7 @@
       <w:r>
         <w:t>SIZE</w:t>
       </w:r>
-      <w:bookmarkEnd w:id="133"/>
+      <w:bookmarkEnd w:id="136"/>
     </w:p>
     <w:p>
       <w:pPr>
@@ -12035,7 +11919,6 @@
         <w:rPr>
           <w:lang w:val="en-US"/>
         </w:rPr>
-        <w:lastRenderedPageBreak/>
         <w:t>This tag is not mandatory. If omitted, size is set to 32748</w:t>
       </w:r>
       <w:r>
@@ -12058,13 +11941,13 @@
           <w:lang w:val="en-US"/>
         </w:rPr>
       </w:pPr>
-      <w:ins w:id="134" w:author="Pascal Heude" w:date="2026-08-01T19:45:00Z">
+      <w:ins w:id="137" w:author="Pascal Heude" w:date="2026-08-01T19:45:00Z">
         <w:r>
           <w:rPr>
             <w:b/>
             <w:color w:val="0070C0"/>
             <w:lang w:val="en-US"/>
-            <w:rPrChange w:id="135" w:author="Pascal Heude" w:date="2026-08-01T19:46:00Z">
+            <w:rPrChange w:id="138" w:author="Pascal Heude" w:date="2026-08-01T19:46:00Z">
               <w:rPr>
                 <w:lang w:val="en-US"/>
               </w:rPr>
@@ -12073,13 +11956,13 @@
           <w:t>U</w:t>
         </w:r>
       </w:ins>
-      <w:ins w:id="136" w:author="Pascal Heude" w:date="2026-08-01T19:46:00Z">
+      <w:ins w:id="139" w:author="Pascal Heude" w:date="2026-08-01T19:46:00Z">
         <w:r>
           <w:rPr>
             <w:b/>
             <w:color w:val="0070C0"/>
             <w:lang w:val="en-US"/>
-            <w:rPrChange w:id="137" w:author="Pascal Heude" w:date="2026-08-01T19:46:00Z">
+            <w:rPrChange w:id="140" w:author="Pascal Heude" w:date="2026-08-01T19:46:00Z">
               <w:rPr>
                 <w:lang w:val="en-US"/>
               </w:rPr>
@@ -12094,7 +11977,7 @@
           <w:t>: If used, t</w:t>
         </w:r>
       </w:ins>
-      <w:del w:id="138" w:author="Pascal Heude" w:date="2026-08-01T19:46:00Z">
+      <w:del w:id="141" w:author="Pascal Heude" w:date="2026-08-01T19:46:00Z">
         <w:r>
           <w:rPr>
             <w:lang w:val="en-US"/>
@@ -12209,6 +12092,7 @@
         <w:rPr>
           <w:lang w:val="en-US"/>
         </w:rPr>
+        <w:lastRenderedPageBreak/>
         <w:t>&lt;SPLIT_SIZE&gt;10000&lt;/SPLIT_SIZE&gt;</w:t>
       </w:r>
     </w:p>
@@ -12223,13 +12107,13 @@
       <w:pPr>
         <w:pStyle w:val="Titre3"/>
       </w:pPr>
-      <w:bookmarkStart w:id="139" w:name="_Tag_DIRECTORY"/>
-      <w:bookmarkStart w:id="140" w:name="_Toc456106027"/>
-      <w:bookmarkEnd w:id="139"/>
+      <w:bookmarkStart w:id="142" w:name="_Tag_DIRECTORY"/>
+      <w:bookmarkStart w:id="143" w:name="_Toc456106027"/>
+      <w:bookmarkEnd w:id="142"/>
       <w:r>
         <w:t>Tag DIRECTORY</w:t>
       </w:r>
-      <w:bookmarkEnd w:id="140"/>
+      <w:bookmarkEnd w:id="143"/>
     </w:p>
     <w:p>
       <w:pPr>
@@ -12247,17 +12131,17 @@
     <w:p>
       <w:pPr>
         <w:rPr>
-          <w:moveTo w:id="141" w:author="Pascal Heude" w:date="2026-08-01T19:46:00Z"/>
-          <w:lang w:val="en-US"/>
-        </w:rPr>
-      </w:pPr>
-      <w:ins w:id="142" w:author="Pascal Heude" w:date="2026-08-01T19:46:00Z">
+          <w:moveTo w:id="144" w:author="Pascal Heude" w:date="2026-08-01T19:46:00Z"/>
+          <w:lang w:val="en-US"/>
+        </w:rPr>
+      </w:pPr>
+      <w:ins w:id="145" w:author="Pascal Heude" w:date="2026-08-01T19:46:00Z">
         <w:r>
           <w:rPr>
             <w:b/>
             <w:color w:val="0070C0"/>
             <w:lang w:val="en-US"/>
-            <w:rPrChange w:id="143" w:author="Pascal Heude" w:date="2026-08-01T19:46:00Z">
+            <w:rPrChange w:id="146" w:author="Pascal Heude" w:date="2026-08-01T19:46:00Z">
               <w:rPr>
                 <w:lang w:val="en-US"/>
               </w:rPr>
@@ -12272,15 +12156,15 @@
           <w:t xml:space="preserve">: </w:t>
         </w:r>
       </w:ins>
-      <w:moveToRangeStart w:id="144" w:author="Pascal Heude" w:date="2026-08-01T19:46:00Z" w:name="move236506022"/>
-      <w:moveTo w:id="145" w:author="Pascal Heude" w:date="2026-08-01T19:46:00Z">
+      <w:moveToRangeStart w:id="147" w:author="Pascal Heude" w:date="2026-08-01T19:46:00Z" w:name="move236506022"/>
+      <w:moveTo w:id="148" w:author="Pascal Heude" w:date="2026-08-01T19:46:00Z">
         <w:r>
           <w:rPr>
             <w:lang w:val="en-US"/>
           </w:rPr>
           <w:t xml:space="preserve">This tag </w:t>
         </w:r>
-        <w:del w:id="146" w:author="Pascal Heude" w:date="2026-08-01T19:47:00Z">
+        <w:del w:id="149" w:author="Pascal Heude" w:date="2026-08-01T19:47:00Z">
           <w:r>
             <w:rPr>
               <w:lang w:val="en-US"/>
@@ -12289,7 +12173,7 @@
           </w:r>
         </w:del>
       </w:moveTo>
-      <w:ins w:id="147" w:author="Pascal Heude" w:date="2026-08-01T19:47:00Z">
+      <w:ins w:id="150" w:author="Pascal Heude" w:date="2026-08-01T19:47:00Z">
         <w:r>
           <w:rPr>
             <w:lang w:val="en-US"/>
@@ -12297,7 +12181,7 @@
           <w:t>shall be</w:t>
         </w:r>
       </w:ins>
-      <w:moveTo w:id="148" w:author="Pascal Heude" w:date="2026-08-01T19:46:00Z">
+      <w:moveTo w:id="151" w:author="Pascal Heude" w:date="2026-08-01T19:46:00Z">
         <w:r>
           <w:rPr>
             <w:lang w:val="en-US"/>
@@ -12306,14 +12190,14 @@
         </w:r>
       </w:moveTo>
     </w:p>
-    <w:moveToRangeEnd w:id="144"/>
-    <w:p>
-      <w:pPr>
-        <w:rPr>
-          <w:lang w:val="en-US"/>
-        </w:rPr>
-      </w:pPr>
-      <w:ins w:id="149" w:author="Pascal Heude" w:date="2026-08-01T19:47:00Z">
+    <w:moveToRangeEnd w:id="147"/>
+    <w:p>
+      <w:pPr>
+        <w:rPr>
+          <w:lang w:val="en-US"/>
+        </w:rPr>
+      </w:pPr>
+      <w:ins w:id="152" w:author="Pascal Heude" w:date="2026-08-01T19:47:00Z">
         <w:r>
           <w:rPr>
             <w:b/>
@@ -12337,7 +12221,7 @@
           <w:t>: t</w:t>
         </w:r>
       </w:ins>
-      <w:del w:id="150" w:author="Pascal Heude" w:date="2026-08-01T19:47:00Z">
+      <w:del w:id="153" w:author="Pascal Heude" w:date="2026-08-01T19:47:00Z">
         <w:r>
           <w:rPr>
             <w:lang w:val="en-US"/>
@@ -12375,7 +12259,7 @@
         </w:rPr>
         <w:t xml:space="preserve"> relative </w:t>
       </w:r>
-      <w:del w:id="151" w:author="Pascal Heude" w:date="2026-07-29T22:51:00Z">
+      <w:del w:id="154" w:author="Pascal Heude" w:date="2026-07-29T22:51:00Z">
         <w:r>
           <w:rPr>
             <w:lang w:val="en-US"/>
@@ -12393,12 +12277,12 @@
     <w:p>
       <w:pPr>
         <w:rPr>
-          <w:moveFrom w:id="152" w:author="Pascal Heude" w:date="2026-08-01T19:46:00Z"/>
-          <w:lang w:val="en-US"/>
-        </w:rPr>
-      </w:pPr>
-      <w:moveFromRangeStart w:id="153" w:author="Pascal Heude" w:date="2026-08-01T19:46:00Z" w:name="move236506022"/>
-      <w:moveFrom w:id="154" w:author="Pascal Heude" w:date="2026-08-01T19:46:00Z">
+          <w:moveFrom w:id="155" w:author="Pascal Heude" w:date="2026-08-01T19:46:00Z"/>
+          <w:lang w:val="en-US"/>
+        </w:rPr>
+      </w:pPr>
+      <w:moveFromRangeStart w:id="156" w:author="Pascal Heude" w:date="2026-08-01T19:46:00Z" w:name="move236506022"/>
+      <w:moveFrom w:id="157" w:author="Pascal Heude" w:date="2026-08-01T19:46:00Z">
         <w:r>
           <w:rPr>
             <w:lang w:val="en-US"/>
@@ -12407,7 +12291,7 @@
         </w:r>
       </w:moveFrom>
     </w:p>
-    <w:moveFromRangeEnd w:id="153"/>
+    <w:moveFromRangeEnd w:id="156"/>
     <w:p>
       <w:pPr>
         <w:rPr>
@@ -12420,7 +12304,7 @@
         </w:rPr>
         <w:t xml:space="preserve">If the directory does not exist, it </w:t>
       </w:r>
-      <w:del w:id="155" w:author="Pascal Heude" w:date="2026-07-29T22:52:00Z">
+      <w:del w:id="158" w:author="Pascal Heude" w:date="2026-07-29T22:52:00Z">
         <w:r>
           <w:rPr>
             <w:lang w:val="en-US"/>
@@ -12428,7 +12312,7 @@
           <w:delText xml:space="preserve">shall </w:delText>
         </w:r>
       </w:del>
-      <w:ins w:id="156" w:author="Pascal Heude" w:date="2026-07-29T22:52:00Z">
+      <w:ins w:id="159" w:author="Pascal Heude" w:date="2026-07-29T22:52:00Z">
         <w:r>
           <w:rPr>
             <w:lang w:val="en-US"/>
@@ -12448,7 +12332,7 @@
         </w:rPr>
         <w:t xml:space="preserve">already </w:t>
       </w:r>
-      <w:del w:id="157" w:author="Pascal Heude" w:date="2026-07-29T22:52:00Z">
+      <w:del w:id="160" w:author="Pascal Heude" w:date="2026-07-29T22:52:00Z">
         <w:r>
           <w:rPr>
             <w:lang w:val="en-US"/>
@@ -12462,7 +12346,7 @@
         </w:rPr>
         <w:t>files</w:t>
       </w:r>
-      <w:ins w:id="158" w:author="Pascal Heude" w:date="2026-07-29T22:52:00Z">
+      <w:ins w:id="161" w:author="Pascal Heude" w:date="2026-07-29T22:52:00Z">
         <w:r>
           <w:rPr>
             <w:lang w:val="en-US"/>
@@ -12476,7 +12360,7 @@
         </w:rPr>
         <w:t xml:space="preserve">, </w:t>
       </w:r>
-      <w:del w:id="159" w:author="Pascal Heude" w:date="2026-07-29T22:52:00Z">
+      <w:del w:id="162" w:author="Pascal Heude" w:date="2026-07-29T22:52:00Z">
         <w:r>
           <w:rPr>
             <w:lang w:val="en-US"/>
@@ -12502,7 +12386,7 @@
           <w:delText>Generate</w:delText>
         </w:r>
       </w:del>
-      <w:ins w:id="160" w:author="Pascal Heude" w:date="2026-07-29T22:52:00Z">
+      <w:ins w:id="163" w:author="Pascal Heude" w:date="2026-07-29T22:52:00Z">
         <w:r>
           <w:rPr>
             <w:lang w:val="en-US"/>
@@ -12568,13 +12452,13 @@
       <w:pPr>
         <w:pStyle w:val="Titre3"/>
       </w:pPr>
-      <w:bookmarkStart w:id="161" w:name="_Tag_THW_ID_LIST"/>
-      <w:bookmarkStart w:id="162" w:name="_Toc456106028"/>
-      <w:bookmarkEnd w:id="161"/>
+      <w:bookmarkStart w:id="164" w:name="_Tag_THW_ID_LIST"/>
+      <w:bookmarkStart w:id="165" w:name="_Toc456106028"/>
+      <w:bookmarkEnd w:id="164"/>
       <w:r>
         <w:t>Tag THW_ID_LIST</w:t>
       </w:r>
-      <w:bookmarkEnd w:id="162"/>
+      <w:bookmarkEnd w:id="165"/>
     </w:p>
     <w:p>
       <w:pPr>
@@ -12667,8 +12551,8 @@
           <w:lang w:val="en-US"/>
         </w:rPr>
       </w:pPr>
-      <w:bookmarkStart w:id="163" w:name="_Tag_THW_ID"/>
-      <w:bookmarkEnd w:id="163"/>
+      <w:bookmarkStart w:id="166" w:name="_Tag_THW_ID"/>
+      <w:bookmarkEnd w:id="166"/>
       <w:r>
         <w:rPr>
           <w:lang w:val="en-US"/>
@@ -12703,11 +12587,11 @@
     <w:p>
       <w:pPr>
         <w:rPr>
-          <w:moveTo w:id="164" w:author="Pascal Heude" w:date="2026-08-01T19:48:00Z"/>
-          <w:lang w:val="en-US"/>
-        </w:rPr>
-      </w:pPr>
-      <w:ins w:id="165" w:author="Pascal Heude" w:date="2026-08-01T19:48:00Z">
+          <w:moveTo w:id="167" w:author="Pascal Heude" w:date="2026-08-01T19:48:00Z"/>
+          <w:lang w:val="en-US"/>
+        </w:rPr>
+      </w:pPr>
+      <w:ins w:id="168" w:author="Pascal Heude" w:date="2026-08-01T19:48:00Z">
         <w:r>
           <w:rPr>
             <w:b/>
@@ -12722,15 +12606,7 @@
             <w:color w:val="0070C0"/>
             <w:lang w:val="en-US"/>
           </w:rPr>
-          <w:t>2</w:t>
-        </w:r>
-        <w:r>
-          <w:rPr>
-            <w:b/>
-            <w:color w:val="0070C0"/>
-            <w:lang w:val="en-US"/>
-          </w:rPr>
-          <w:t>1</w:t>
+          <w:t>21</w:t>
         </w:r>
         <w:r>
           <w:rPr>
@@ -12739,9 +12615,9 @@
           <w:t xml:space="preserve">: </w:t>
         </w:r>
       </w:ins>
-      <w:moveToRangeStart w:id="166" w:author="Pascal Heude" w:date="2026-08-01T19:48:00Z" w:name="move236506110"/>
-      <w:moveTo w:id="167" w:author="Pascal Heude" w:date="2026-08-01T19:48:00Z">
-        <w:del w:id="168" w:author="Pascal Heude" w:date="2026-08-01T19:48:00Z">
+      <w:moveToRangeStart w:id="169" w:author="Pascal Heude" w:date="2026-08-01T19:48:00Z" w:name="move236506110"/>
+      <w:moveTo w:id="170" w:author="Pascal Heude" w:date="2026-08-01T19:48:00Z">
+        <w:del w:id="171" w:author="Pascal Heude" w:date="2026-08-01T19:48:00Z">
           <w:r>
             <w:rPr>
               <w:lang w:val="en-US"/>
@@ -12750,7 +12626,7 @@
           </w:r>
         </w:del>
       </w:moveTo>
-      <w:ins w:id="169" w:author="Pascal Heude" w:date="2026-08-01T19:48:00Z">
+      <w:ins w:id="172" w:author="Pascal Heude" w:date="2026-08-01T19:48:00Z">
         <w:r>
           <w:rPr>
             <w:lang w:val="en-US"/>
@@ -12758,14 +12634,14 @@
           <w:t>t</w:t>
         </w:r>
       </w:ins>
-      <w:moveTo w:id="170" w:author="Pascal Heude" w:date="2026-08-01T19:48:00Z">
+      <w:moveTo w:id="173" w:author="Pascal Heude" w:date="2026-08-01T19:48:00Z">
         <w:r>
           <w:rPr>
             <w:lang w:val="en-US"/>
           </w:rPr>
           <w:t xml:space="preserve">he attribute </w:t>
         </w:r>
-        <w:del w:id="171" w:author="Pascal Heude" w:date="2026-08-01T19:48:00Z">
+        <w:del w:id="174" w:author="Pascal Heude" w:date="2026-08-01T19:48:00Z">
           <w:r>
             <w:rPr>
               <w:lang w:val="en-US"/>
@@ -12774,7 +12650,7 @@
           </w:r>
         </w:del>
       </w:moveTo>
-      <w:ins w:id="172" w:author="Pascal Heude" w:date="2026-08-01T19:48:00Z">
+      <w:ins w:id="175" w:author="Pascal Heude" w:date="2026-08-01T19:48:00Z">
         <w:r>
           <w:rPr>
             <w:lang w:val="en-US"/>
@@ -12782,7 +12658,7 @@
           <w:t>shall be</w:t>
         </w:r>
       </w:ins>
-      <w:moveTo w:id="173" w:author="Pascal Heude" w:date="2026-08-01T19:48:00Z">
+      <w:moveTo w:id="176" w:author="Pascal Heude" w:date="2026-08-01T19:48:00Z">
         <w:r>
           <w:rPr>
             <w:lang w:val="en-US"/>
@@ -12791,14 +12667,14 @@
         </w:r>
       </w:moveTo>
     </w:p>
-    <w:moveToRangeEnd w:id="166"/>
-    <w:p>
-      <w:pPr>
-        <w:rPr>
-          <w:lang w:val="en-US"/>
-        </w:rPr>
-      </w:pPr>
-      <w:ins w:id="174" w:author="Pascal Heude" w:date="2026-08-01T19:48:00Z">
+    <w:moveToRangeEnd w:id="169"/>
+    <w:p>
+      <w:pPr>
+        <w:rPr>
+          <w:lang w:val="en-US"/>
+        </w:rPr>
+      </w:pPr>
+      <w:ins w:id="177" w:author="Pascal Heude" w:date="2026-08-01T19:48:00Z">
         <w:r>
           <w:rPr>
             <w:b/>
@@ -12813,15 +12689,7 @@
             <w:color w:val="0070C0"/>
             <w:lang w:val="en-US"/>
           </w:rPr>
-          <w:t>2</w:t>
-        </w:r>
-        <w:r>
-          <w:rPr>
-            <w:b/>
-            <w:color w:val="0070C0"/>
-            <w:lang w:val="en-US"/>
-          </w:rPr>
-          <w:t>2</w:t>
+          <w:t>22</w:t>
         </w:r>
         <w:r>
           <w:rPr>
@@ -12846,12 +12714,12 @@
     <w:p>
       <w:pPr>
         <w:rPr>
-          <w:moveFrom w:id="175" w:author="Pascal Heude" w:date="2026-08-01T19:48:00Z"/>
-          <w:lang w:val="en-US"/>
-        </w:rPr>
-      </w:pPr>
-      <w:moveFromRangeStart w:id="176" w:author="Pascal Heude" w:date="2026-08-01T19:48:00Z" w:name="move236506110"/>
-      <w:moveFrom w:id="177" w:author="Pascal Heude" w:date="2026-08-01T19:48:00Z">
+          <w:moveFrom w:id="178" w:author="Pascal Heude" w:date="2026-08-01T19:48:00Z"/>
+          <w:lang w:val="en-US"/>
+        </w:rPr>
+      </w:pPr>
+      <w:moveFromRangeStart w:id="179" w:author="Pascal Heude" w:date="2026-08-01T19:48:00Z" w:name="move236506110"/>
+      <w:moveFrom w:id="180" w:author="Pascal Heude" w:date="2026-08-01T19:48:00Z">
         <w:r>
           <w:rPr>
             <w:lang w:val="en-US"/>
@@ -12866,7 +12734,7 @@
         </w:r>
       </w:moveFrom>
     </w:p>
-    <w:moveFromRangeEnd w:id="176"/>
+    <w:moveFromRangeEnd w:id="179"/>
     <w:p>
       <w:pPr>
         <w:rPr>
@@ -12942,13 +12810,13 @@
       <w:pPr>
         <w:pStyle w:val="Titre3"/>
       </w:pPr>
-      <w:bookmarkStart w:id="178" w:name="_Tag_THW_ID_1"/>
-      <w:bookmarkStart w:id="179" w:name="_Toc456106029"/>
-      <w:bookmarkEnd w:id="178"/>
+      <w:bookmarkStart w:id="181" w:name="_Tag_THW_ID_1"/>
+      <w:bookmarkStart w:id="182" w:name="_Toc456106029"/>
+      <w:bookmarkEnd w:id="181"/>
       <w:r>
         <w:t>Tag THW_ID</w:t>
       </w:r>
-      <w:bookmarkEnd w:id="179"/>
+      <w:bookmarkEnd w:id="182"/>
     </w:p>
     <w:p>
       <w:pPr>
@@ -13002,17 +12870,17 @@
     <w:p>
       <w:pPr>
         <w:rPr>
-          <w:moveTo w:id="180" w:author="Pascal Heude" w:date="2026-08-01T21:11:00Z"/>
-          <w:lang w:val="en-US"/>
-        </w:rPr>
-      </w:pPr>
-      <w:ins w:id="181" w:author="Pascal Heude" w:date="2026-08-01T21:11:00Z">
+          <w:moveTo w:id="183" w:author="Pascal Heude" w:date="2026-08-01T21:11:00Z"/>
+          <w:lang w:val="en-US"/>
+        </w:rPr>
+      </w:pPr>
+      <w:ins w:id="184" w:author="Pascal Heude" w:date="2026-08-01T21:11:00Z">
         <w:r>
           <w:rPr>
             <w:b/>
             <w:color w:val="0070C0"/>
             <w:lang w:val="en-US"/>
-            <w:rPrChange w:id="182" w:author="Pascal Heude" w:date="2026-08-01T21:11:00Z">
+            <w:rPrChange w:id="185" w:author="Pascal Heude" w:date="2026-08-01T21:11:00Z">
               <w:rPr>
                 <w:lang w:val="en-US"/>
               </w:rPr>
@@ -13027,15 +12895,15 @@
           <w:t xml:space="preserve">: </w:t>
         </w:r>
       </w:ins>
-      <w:moveToRangeStart w:id="183" w:author="Pascal Heude" w:date="2026-08-01T21:11:00Z" w:name="move236511099"/>
-      <w:moveTo w:id="184" w:author="Pascal Heude" w:date="2026-08-01T21:11:00Z">
+      <w:moveToRangeStart w:id="186" w:author="Pascal Heude" w:date="2026-08-01T21:11:00Z" w:name="move236511099"/>
+      <w:moveTo w:id="187" w:author="Pascal Heude" w:date="2026-08-01T21:11:00Z">
         <w:r>
           <w:rPr>
             <w:lang w:val="en-US"/>
           </w:rPr>
           <w:t xml:space="preserve">This tag </w:t>
         </w:r>
-        <w:del w:id="185" w:author="Pascal Heude" w:date="2026-08-01T21:12:00Z">
+        <w:del w:id="188" w:author="Pascal Heude" w:date="2026-08-01T21:12:00Z">
           <w:r>
             <w:rPr>
               <w:lang w:val="en-US"/>
@@ -13044,7 +12912,7 @@
           </w:r>
         </w:del>
       </w:moveTo>
-      <w:ins w:id="186" w:author="Pascal Heude" w:date="2026-08-01T21:12:00Z">
+      <w:ins w:id="189" w:author="Pascal Heude" w:date="2026-08-01T21:12:00Z">
         <w:r>
           <w:rPr>
             <w:lang w:val="en-US"/>
@@ -13052,7 +12920,7 @@
           <w:t>shall be</w:t>
         </w:r>
       </w:ins>
-      <w:moveTo w:id="187" w:author="Pascal Heude" w:date="2026-08-01T21:11:00Z">
+      <w:moveTo w:id="190" w:author="Pascal Heude" w:date="2026-08-01T21:11:00Z">
         <w:r>
           <w:rPr>
             <w:lang w:val="en-US"/>
@@ -13102,20 +12970,20 @@
         </w:r>
       </w:moveTo>
     </w:p>
-    <w:moveToRangeEnd w:id="183"/>
-    <w:p>
-      <w:pPr>
-        <w:rPr>
-          <w:lang w:val="en-US"/>
-        </w:rPr>
-      </w:pPr>
-      <w:ins w:id="188" w:author="Pascal Heude" w:date="2026-08-01T21:11:00Z">
+    <w:moveToRangeEnd w:id="186"/>
+    <w:p>
+      <w:pPr>
+        <w:rPr>
+          <w:lang w:val="en-US"/>
+        </w:rPr>
+      </w:pPr>
+      <w:ins w:id="191" w:author="Pascal Heude" w:date="2026-08-01T21:11:00Z">
         <w:r>
           <w:rPr>
             <w:b/>
             <w:color w:val="0070C0"/>
             <w:lang w:val="en-US"/>
-            <w:rPrChange w:id="189" w:author="Pascal Heude" w:date="2026-08-01T21:11:00Z">
+            <w:rPrChange w:id="192" w:author="Pascal Heude" w:date="2026-08-01T21:11:00Z">
               <w:rPr>
                 <w:lang w:val="en-US"/>
               </w:rPr>
@@ -13140,12 +13008,12 @@
     <w:p>
       <w:pPr>
         <w:rPr>
-          <w:moveFrom w:id="190" w:author="Pascal Heude" w:date="2026-08-01T21:11:00Z"/>
-          <w:lang w:val="en-US"/>
-        </w:rPr>
-      </w:pPr>
-      <w:moveFromRangeStart w:id="191" w:author="Pascal Heude" w:date="2026-08-01T21:11:00Z" w:name="move236511099"/>
-      <w:moveFrom w:id="192" w:author="Pascal Heude" w:date="2026-08-01T21:11:00Z">
+          <w:moveFrom w:id="193" w:author="Pascal Heude" w:date="2026-08-01T21:11:00Z"/>
+          <w:lang w:val="en-US"/>
+        </w:rPr>
+      </w:pPr>
+      <w:moveFromRangeStart w:id="194" w:author="Pascal Heude" w:date="2026-08-01T21:11:00Z" w:name="move236511099"/>
+      <w:moveFrom w:id="195" w:author="Pascal Heude" w:date="2026-08-01T21:11:00Z">
         <w:r>
           <w:rPr>
             <w:lang w:val="en-US"/>
@@ -13207,7 +13075,7 @@
         </w:r>
       </w:moveFrom>
     </w:p>
-    <w:moveFromRangeEnd w:id="191"/>
+    <w:moveFromRangeEnd w:id="194"/>
     <w:p>
       <w:pPr>
         <w:rPr>
@@ -13364,7 +13232,6 @@
         <w:rPr>
           <w:lang w:val="en-US"/>
         </w:rPr>
-        <w:lastRenderedPageBreak/>
         <w:t>&lt;THW_ID_LIST &gt;</w:t>
       </w:r>
       <w:r>
@@ -13386,13 +13253,13 @@
       <w:pPr>
         <w:pStyle w:val="Titre3"/>
       </w:pPr>
-      <w:bookmarkStart w:id="193" w:name="_Tag_SUPPORT_FILE_LIST"/>
-      <w:bookmarkStart w:id="194" w:name="_Toc456106030"/>
-      <w:bookmarkEnd w:id="193"/>
+      <w:bookmarkStart w:id="196" w:name="_Tag_SUPPORT_FILE_LIST"/>
+      <w:bookmarkStart w:id="197" w:name="_Toc456106030"/>
+      <w:bookmarkEnd w:id="196"/>
       <w:r>
         <w:t>Tag SUPPORT_FILE_LIST</w:t>
       </w:r>
-      <w:bookmarkEnd w:id="194"/>
+      <w:bookmarkEnd w:id="197"/>
     </w:p>
     <w:p>
       <w:pPr>
@@ -13477,21 +13344,14 @@
         <w:rPr>
           <w:lang w:val="en-US"/>
         </w:rPr>
+        <w:lastRenderedPageBreak/>
         <w:t xml:space="preserve">The attribute </w:t>
       </w:r>
-      <w:proofErr w:type="spellStart"/>
-      <w:r>
-        <w:rPr>
-          <w:lang w:val="en-US"/>
-        </w:rPr>
-        <w:t>integrity_check</w:t>
-      </w:r>
-      <w:proofErr w:type="spellEnd"/>
-      <w:r>
-        <w:rPr>
-          <w:lang w:val="en-US"/>
-        </w:rPr>
-        <w:t xml:space="preserve"> </w:t>
+      <w:r>
+        <w:rPr>
+          <w:lang w:val="en-US"/>
+        </w:rPr>
+        <w:t xml:space="preserve">integrity_check </w:t>
       </w:r>
       <w:r>
         <w:rPr>
@@ -13644,11 +13504,11 @@
     <w:p>
       <w:pPr>
         <w:rPr>
-          <w:moveTo w:id="195" w:author="Pascal Heude" w:date="2026-08-01T21:12:00Z"/>
-          <w:lang w:val="en-US"/>
-        </w:rPr>
-      </w:pPr>
-      <w:ins w:id="196" w:author="Pascal Heude" w:date="2026-08-01T21:13:00Z">
+          <w:moveTo w:id="198" w:author="Pascal Heude" w:date="2026-08-01T21:12:00Z"/>
+          <w:lang w:val="en-US"/>
+        </w:rPr>
+      </w:pPr>
+      <w:ins w:id="199" w:author="Pascal Heude" w:date="2026-08-01T21:13:00Z">
         <w:r>
           <w:rPr>
             <w:b/>
@@ -13658,7 +13518,7 @@
           <w:t>URQT_</w:t>
         </w:r>
       </w:ins>
-      <w:ins w:id="197" w:author="Pascal Heude" w:date="2026-08-01T22:10:00Z">
+      <w:ins w:id="200" w:author="Pascal Heude" w:date="2026-08-01T22:10:00Z">
         <w:r>
           <w:rPr>
             <w:b/>
@@ -13668,9 +13528,9 @@
           <w:t>25</w:t>
         </w:r>
       </w:ins>
-      <w:moveToRangeStart w:id="198" w:author="Pascal Heude" w:date="2026-08-01T21:12:00Z" w:name="move236511174"/>
-      <w:moveTo w:id="199" w:author="Pascal Heude" w:date="2026-08-01T21:12:00Z">
-        <w:del w:id="200" w:author="Pascal Heude" w:date="2026-08-01T21:13:00Z">
+      <w:moveToRangeStart w:id="201" w:author="Pascal Heude" w:date="2026-08-01T21:12:00Z" w:name="move236511174"/>
+      <w:moveTo w:id="202" w:author="Pascal Heude" w:date="2026-08-01T21:12:00Z">
+        <w:del w:id="203" w:author="Pascal Heude" w:date="2026-08-01T21:13:00Z">
           <w:r>
             <w:rPr>
               <w:lang w:val="en-US"/>
@@ -13679,7 +13539,7 @@
           </w:r>
         </w:del>
       </w:moveTo>
-      <w:ins w:id="201" w:author="Pascal Heude" w:date="2026-08-01T21:13:00Z">
+      <w:ins w:id="204" w:author="Pascal Heude" w:date="2026-08-01T21:13:00Z">
         <w:r>
           <w:rPr>
             <w:lang w:val="en-US"/>
@@ -13687,14 +13547,14 @@
           <w:t>: t</w:t>
         </w:r>
       </w:ins>
-      <w:moveTo w:id="202" w:author="Pascal Heude" w:date="2026-08-01T21:12:00Z">
+      <w:moveTo w:id="205" w:author="Pascal Heude" w:date="2026-08-01T21:12:00Z">
         <w:r>
           <w:rPr>
             <w:lang w:val="en-US"/>
           </w:rPr>
           <w:t xml:space="preserve">he attribute </w:t>
         </w:r>
-        <w:del w:id="203" w:author="Pascal Heude" w:date="2026-08-01T21:13:00Z">
+        <w:del w:id="206" w:author="Pascal Heude" w:date="2026-08-01T21:13:00Z">
           <w:r>
             <w:rPr>
               <w:lang w:val="en-US"/>
@@ -13703,7 +13563,7 @@
           </w:r>
         </w:del>
       </w:moveTo>
-      <w:ins w:id="204" w:author="Pascal Heude" w:date="2026-08-01T21:13:00Z">
+      <w:ins w:id="207" w:author="Pascal Heude" w:date="2026-08-01T21:13:00Z">
         <w:r>
           <w:rPr>
             <w:lang w:val="en-US"/>
@@ -13711,7 +13571,7 @@
           <w:t>shall be</w:t>
         </w:r>
       </w:ins>
-      <w:moveTo w:id="205" w:author="Pascal Heude" w:date="2026-08-01T21:12:00Z">
+      <w:moveTo w:id="208" w:author="Pascal Heude" w:date="2026-08-01T21:12:00Z">
         <w:r>
           <w:rPr>
             <w:lang w:val="en-US"/>
@@ -13720,20 +13580,20 @@
         </w:r>
       </w:moveTo>
     </w:p>
-    <w:moveToRangeEnd w:id="198"/>
-    <w:p>
-      <w:pPr>
-        <w:rPr>
-          <w:lang w:val="en-US"/>
-        </w:rPr>
-      </w:pPr>
-      <w:ins w:id="206" w:author="Pascal Heude" w:date="2026-08-01T21:12:00Z">
+    <w:moveToRangeEnd w:id="201"/>
+    <w:p>
+      <w:pPr>
+        <w:rPr>
+          <w:lang w:val="en-US"/>
+        </w:rPr>
+      </w:pPr>
+      <w:ins w:id="209" w:author="Pascal Heude" w:date="2026-08-01T21:12:00Z">
         <w:r>
           <w:rPr>
             <w:b/>
             <w:color w:val="0070C0"/>
             <w:lang w:val="en-US"/>
-            <w:rPrChange w:id="207" w:author="Pascal Heude" w:date="2026-08-01T21:13:00Z">
+            <w:rPrChange w:id="210" w:author="Pascal Heude" w:date="2026-08-01T21:13:00Z">
               <w:rPr>
                 <w:lang w:val="en-US"/>
               </w:rPr>
@@ -13742,7 +13602,7 @@
           <w:t>URQT_2</w:t>
         </w:r>
       </w:ins>
-      <w:ins w:id="208" w:author="Pascal Heude" w:date="2026-08-01T22:10:00Z">
+      <w:ins w:id="211" w:author="Pascal Heude" w:date="2026-08-01T22:10:00Z">
         <w:r>
           <w:rPr>
             <w:b/>
@@ -13752,7 +13612,7 @@
           <w:t>6</w:t>
         </w:r>
       </w:ins>
-      <w:ins w:id="209" w:author="Pascal Heude" w:date="2026-08-01T21:12:00Z">
+      <w:ins w:id="212" w:author="Pascal Heude" w:date="2026-08-01T21:12:00Z">
         <w:r>
           <w:rPr>
             <w:lang w:val="en-US"/>
@@ -13770,12 +13630,12 @@
     <w:p>
       <w:pPr>
         <w:rPr>
-          <w:moveFrom w:id="210" w:author="Pascal Heude" w:date="2026-08-01T21:12:00Z"/>
-          <w:lang w:val="en-US"/>
-        </w:rPr>
-      </w:pPr>
-      <w:moveFromRangeStart w:id="211" w:author="Pascal Heude" w:date="2026-08-01T21:12:00Z" w:name="move236511174"/>
-      <w:moveFrom w:id="212" w:author="Pascal Heude" w:date="2026-08-01T21:12:00Z">
+          <w:moveFrom w:id="213" w:author="Pascal Heude" w:date="2026-08-01T21:12:00Z"/>
+          <w:lang w:val="en-US"/>
+        </w:rPr>
+      </w:pPr>
+      <w:moveFromRangeStart w:id="214" w:author="Pascal Heude" w:date="2026-08-01T21:12:00Z" w:name="move236511174"/>
+      <w:moveFrom w:id="215" w:author="Pascal Heude" w:date="2026-08-01T21:12:00Z">
         <w:r>
           <w:rPr>
             <w:lang w:val="en-US"/>
@@ -13784,7 +13644,7 @@
         </w:r>
       </w:moveFrom>
     </w:p>
-    <w:moveFromRangeEnd w:id="211"/>
+    <w:moveFromRangeEnd w:id="214"/>
     <w:p>
       <w:pPr>
         <w:rPr>
@@ -13884,13 +13744,13 @@
       <w:pPr>
         <w:pStyle w:val="Titre3"/>
       </w:pPr>
-      <w:bookmarkStart w:id="213" w:name="_Tag_SUPPORT_FILE"/>
-      <w:bookmarkStart w:id="214" w:name="_Toc456106031"/>
-      <w:bookmarkEnd w:id="213"/>
+      <w:bookmarkStart w:id="216" w:name="_Tag_SUPPORT_FILE"/>
+      <w:bookmarkStart w:id="217" w:name="_Toc456106031"/>
+      <w:bookmarkEnd w:id="216"/>
       <w:r>
         <w:t>Tag SUPPORT_FILE</w:t>
       </w:r>
-      <w:bookmarkEnd w:id="214"/>
+      <w:bookmarkEnd w:id="217"/>
     </w:p>
     <w:p>
       <w:pPr>
@@ -13926,11 +13786,11 @@
     <w:p>
       <w:pPr>
         <w:rPr>
-          <w:ins w:id="215" w:author="Pascal Heude" w:date="2026-07-29T22:59:00Z"/>
-          <w:lang w:val="en-US"/>
-        </w:rPr>
-      </w:pPr>
-      <w:ins w:id="216" w:author="Pascal Heude" w:date="2026-08-01T21:16:00Z">
+          <w:ins w:id="218" w:author="Pascal Heude" w:date="2026-07-29T22:59:00Z"/>
+          <w:lang w:val="en-US"/>
+        </w:rPr>
+      </w:pPr>
+      <w:ins w:id="219" w:author="Pascal Heude" w:date="2026-08-01T21:16:00Z">
         <w:r>
           <w:rPr>
             <w:b/>
@@ -13940,7 +13800,7 @@
           <w:t>URQT_2</w:t>
         </w:r>
       </w:ins>
-      <w:ins w:id="217" w:author="Pascal Heude" w:date="2026-08-01T22:11:00Z">
+      <w:ins w:id="220" w:author="Pascal Heude" w:date="2026-08-01T22:11:00Z">
         <w:r>
           <w:rPr>
             <w:b/>
@@ -13950,7 +13810,7 @@
           <w:t>7</w:t>
         </w:r>
       </w:ins>
-      <w:ins w:id="218" w:author="Pascal Heude" w:date="2026-08-01T21:16:00Z">
+      <w:ins w:id="221" w:author="Pascal Heude" w:date="2026-08-01T21:16:00Z">
         <w:r>
           <w:rPr>
             <w:lang w:val="en-US"/>
@@ -13964,7 +13824,7 @@
         </w:rPr>
         <w:t xml:space="preserve">The content shall be a </w:t>
       </w:r>
-      <w:del w:id="219" w:author="Pascal Heude" w:date="2026-08-01T21:16:00Z">
+      <w:del w:id="222" w:author="Pascal Heude" w:date="2026-08-01T21:16:00Z">
         <w:r>
           <w:rPr>
             <w:lang w:val="en-US"/>
@@ -13972,7 +13832,7 @@
           <w:delText>list of characters</w:delText>
         </w:r>
       </w:del>
-      <w:ins w:id="220" w:author="Pascal Heude" w:date="2026-08-01T21:16:00Z">
+      <w:ins w:id="223" w:author="Pascal Heude" w:date="2026-08-01T21:16:00Z">
         <w:r>
           <w:rPr>
             <w:lang w:val="en-US"/>
@@ -13980,7 +13840,7 @@
           <w:t>readable fil</w:t>
         </w:r>
       </w:ins>
-      <w:ins w:id="221" w:author="Pascal Heude" w:date="2026-08-01T21:17:00Z">
+      <w:ins w:id="224" w:author="Pascal Heude" w:date="2026-08-01T21:17:00Z">
         <w:r>
           <w:rPr>
             <w:lang w:val="en-US"/>
@@ -13994,7 +13854,7 @@
         </w:rPr>
         <w:t>.</w:t>
       </w:r>
-      <w:ins w:id="222" w:author="Pascal Heude" w:date="2026-07-29T23:20:00Z">
+      <w:ins w:id="225" w:author="Pascal Heude" w:date="2026-07-29T23:20:00Z">
         <w:r>
           <w:rPr>
             <w:lang w:val="en-US"/>
@@ -14002,7 +13862,7 @@
           <w:t xml:space="preserve"> The name of support file shall not be identical to the name of data files (</w:t>
         </w:r>
       </w:ins>
-      <w:ins w:id="223" w:author="Pascal Heude" w:date="2026-07-29T23:22:00Z">
+      <w:ins w:id="226" w:author="Pascal Heude" w:date="2026-07-29T23:22:00Z">
         <w:r>
           <w:rPr>
             <w:lang w:val="en-US"/>
@@ -14033,7 +13893,7 @@
         </w:rPr>
         <w:fldChar w:fldCharType="separate"/>
       </w:r>
-      <w:ins w:id="224" w:author="Pascal Heude" w:date="2026-07-29T23:22:00Z">
+      <w:ins w:id="227" w:author="Pascal Heude" w:date="2026-07-29T23:22:00Z">
         <w:r>
           <w:rPr>
             <w:lang w:val="en-US"/>
@@ -14047,7 +13907,7 @@
           <w:fldChar w:fldCharType="end"/>
         </w:r>
       </w:ins>
-      <w:ins w:id="225" w:author="Pascal Heude" w:date="2026-07-29T23:23:00Z">
+      <w:ins w:id="228" w:author="Pascal Heude" w:date="2026-07-29T23:23:00Z">
         <w:r>
           <w:rPr>
             <w:lang w:val="en-US"/>
@@ -14055,7 +13915,7 @@
           <w:t>)</w:t>
         </w:r>
       </w:ins>
-      <w:ins w:id="226" w:author="Pascal Heude" w:date="2026-07-29T23:22:00Z">
+      <w:ins w:id="229" w:author="Pascal Heude" w:date="2026-07-29T23:22:00Z">
         <w:r>
           <w:rPr>
             <w:lang w:val="en-US"/>
@@ -14070,7 +13930,7 @@
           <w:lang w:val="en-US"/>
         </w:rPr>
       </w:pPr>
-      <w:ins w:id="227" w:author="Pascal Heude" w:date="2026-07-29T22:59:00Z">
+      <w:ins w:id="230" w:author="Pascal Heude" w:date="2026-07-29T22:59:00Z">
         <w:r>
           <w:rPr>
             <w:lang w:val="en-US"/>
@@ -14078,7 +13938,7 @@
           <w:t xml:space="preserve">The support files will be copied in the directory provided by the tag </w:t>
         </w:r>
       </w:ins>
-      <w:ins w:id="228" w:author="Pascal Heude" w:date="2026-07-29T23:02:00Z">
+      <w:ins w:id="231" w:author="Pascal Heude" w:date="2026-07-29T23:02:00Z">
         <w:r>
           <w:rPr>
             <w:lang w:val="en-US"/>
@@ -14111,7 +13971,7 @@
           <w:fldChar w:fldCharType="end"/>
         </w:r>
       </w:ins>
-      <w:ins w:id="229" w:author="Pascal Heude" w:date="2026-07-29T23:24:00Z">
+      <w:ins w:id="232" w:author="Pascal Heude" w:date="2026-07-29T23:24:00Z">
         <w:r>
           <w:rPr>
             <w:lang w:val="en-US"/>
@@ -14119,7 +13979,7 @@
           <w:t>, with the dat</w:t>
         </w:r>
       </w:ins>
-      <w:ins w:id="230" w:author="Pascal Heude" w:date="2026-07-29T23:26:00Z">
+      <w:ins w:id="233" w:author="Pascal Heude" w:date="2026-07-29T23:26:00Z">
         <w:r>
           <w:rPr>
             <w:lang w:val="en-US"/>
@@ -14127,7 +13987,7 @@
           <w:t>a</w:t>
         </w:r>
       </w:ins>
-      <w:ins w:id="231" w:author="Pascal Heude" w:date="2026-07-29T23:24:00Z">
+      <w:ins w:id="234" w:author="Pascal Heude" w:date="2026-07-29T23:24:00Z">
         <w:r>
           <w:rPr>
             <w:lang w:val="en-US"/>
@@ -14135,7 +13995,7 @@
           <w:t xml:space="preserve"> files</w:t>
         </w:r>
       </w:ins>
-      <w:ins w:id="232" w:author="Pascal Heude" w:date="2026-07-29T23:01:00Z">
+      <w:ins w:id="235" w:author="Pascal Heude" w:date="2026-07-29T23:01:00Z">
         <w:r>
           <w:rPr>
             <w:lang w:val="en-US"/>
@@ -14150,7 +14010,7 @@
           <w:lang w:val="en-US"/>
         </w:rPr>
       </w:pPr>
-      <w:ins w:id="233" w:author="Pascal Heude" w:date="2026-08-01T21:17:00Z">
+      <w:ins w:id="236" w:author="Pascal Heude" w:date="2026-08-01T21:17:00Z">
         <w:r>
           <w:rPr>
             <w:b/>
@@ -14160,7 +14020,7 @@
           <w:t>URQT_2</w:t>
         </w:r>
       </w:ins>
-      <w:ins w:id="234" w:author="Pascal Heude" w:date="2026-08-01T22:11:00Z">
+      <w:ins w:id="237" w:author="Pascal Heude" w:date="2026-08-01T22:11:00Z">
         <w:r>
           <w:rPr>
             <w:b/>
@@ -14170,7 +14030,7 @@
           <w:t>8</w:t>
         </w:r>
       </w:ins>
-      <w:ins w:id="235" w:author="Pascal Heude" w:date="2026-08-01T21:17:00Z">
+      <w:ins w:id="238" w:author="Pascal Heude" w:date="2026-08-01T21:17:00Z">
         <w:r>
           <w:rPr>
             <w:lang w:val="en-US"/>
@@ -14393,7 +14253,7 @@
         </w:rPr>
         <w:t>&lt;SUPPORT_FILE&gt;c:\temp\</w:t>
       </w:r>
-      <w:del w:id="236" w:author="Pascal Heude" w:date="2026-07-29T22:54:00Z">
+      <w:del w:id="239" w:author="Pascal Heude" w:date="2026-07-29T22:54:00Z">
         <w:r>
           <w:rPr>
             <w:lang w:val="en-US"/>
@@ -14401,7 +14261,7 @@
           <w:delText>file1</w:delText>
         </w:r>
       </w:del>
-      <w:ins w:id="237" w:author="Pascal Heude" w:date="2026-07-29T22:54:00Z">
+      <w:ins w:id="240" w:author="Pascal Heude" w:date="2026-07-29T22:54:00Z">
         <w:r>
           <w:rPr>
             <w:lang w:val="en-US"/>
@@ -14459,13 +14319,13 @@
       <w:pPr>
         <w:pStyle w:val="Titre3"/>
       </w:pPr>
-      <w:bookmarkStart w:id="238" w:name="_Tag_USER_DATA"/>
-      <w:bookmarkStart w:id="239" w:name="_Toc456106032"/>
-      <w:bookmarkEnd w:id="238"/>
+      <w:bookmarkStart w:id="241" w:name="_Tag_USER_DATA"/>
+      <w:bookmarkStart w:id="242" w:name="_Toc456106032"/>
+      <w:bookmarkEnd w:id="241"/>
       <w:r>
         <w:t>Tag USER_DATA</w:t>
       </w:r>
-      <w:bookmarkEnd w:id="239"/>
+      <w:bookmarkEnd w:id="242"/>
     </w:p>
     <w:p>
       <w:pPr>
@@ -14528,7 +14388,160 @@
           <w:lang w:val="en-US"/>
         </w:rPr>
       </w:pPr>
-      <w:ins w:id="240" w:author="Pascal Heude" w:date="2026-08-01T21:19:00Z">
+      <w:ins w:id="243" w:author="Pascal Heude" w:date="2026-08-01T21:19:00Z">
+        <w:r>
+          <w:rPr>
+            <w:b/>
+            <w:color w:val="0070C0"/>
+            <w:lang w:val="en-US"/>
+          </w:rPr>
+          <w:t>URQT_</w:t>
+        </w:r>
+      </w:ins>
+      <w:ins w:id="244" w:author="Pascal Heude" w:date="2026-08-01T22:11:00Z">
+        <w:r>
+          <w:rPr>
+            <w:b/>
+            <w:color w:val="0070C0"/>
+            <w:lang w:val="en-US"/>
+          </w:rPr>
+          <w:t>29</w:t>
+        </w:r>
+      </w:ins>
+      <w:ins w:id="245" w:author="Pascal Heude" w:date="2026-08-01T21:19:00Z">
+        <w:r>
+          <w:rPr>
+            <w:lang w:val="en-US"/>
+          </w:rPr>
+          <w:t xml:space="preserve">: </w:t>
+        </w:r>
+      </w:ins>
+      <w:r>
+        <w:rPr>
+          <w:lang w:val="en-US"/>
+        </w:rPr>
+        <w:t xml:space="preserve">The content shall be </w:t>
+      </w:r>
+      <w:r>
+        <w:rPr>
+          <w:lang w:val="en-US"/>
+        </w:rPr>
+        <w:t>the</w:t>
+      </w:r>
+      <w:r>
+        <w:rPr>
+          <w:lang w:val="en-US"/>
+        </w:rPr>
+        <w:t xml:space="preserve"> tag </w:t>
+      </w:r>
+      <w:hyperlink w:anchor="_Tag_USER_DATA_FILE" w:history="1">
+        <w:r>
+          <w:rPr>
+            <w:rStyle w:val="Lienhypertexte"/>
+            <w:lang w:val="en-US"/>
+          </w:rPr>
+          <w:t>USER_DATA_FILE</w:t>
+        </w:r>
+      </w:hyperlink>
+      <w:r>
+        <w:rPr>
+          <w:lang w:val="en-US"/>
+        </w:rPr>
+        <w:t xml:space="preserve"> or the tag </w:t>
+      </w:r>
+      <w:hyperlink w:anchor="_Tag_USER_DATA_TEXT" w:history="1">
+        <w:r>
+          <w:rPr>
+            <w:rStyle w:val="Lienhypertexte"/>
+            <w:lang w:val="en-US"/>
+          </w:rPr>
+          <w:t>USER_DATA_TEXT</w:t>
+        </w:r>
+      </w:hyperlink>
+      <w:r>
+        <w:rPr>
+          <w:lang w:val="en-US"/>
+        </w:rPr>
+        <w:t>.</w:t>
+      </w:r>
+    </w:p>
+    <w:p>
+      <w:pPr>
+        <w:rPr>
+          <w:lang w:val="en-US"/>
+        </w:rPr>
+      </w:pPr>
+      <w:r>
+        <w:rPr>
+          <w:lang w:val="en-US"/>
+        </w:rPr>
+        <w:t xml:space="preserve">This tag is </w:t>
+      </w:r>
+      <w:r>
+        <w:rPr>
+          <w:lang w:val="en-US"/>
+        </w:rPr>
+        <w:t xml:space="preserve">not </w:t>
+      </w:r>
+      <w:r>
+        <w:rPr>
+          <w:lang w:val="en-US"/>
+        </w:rPr>
+        <w:t>mandatory.</w:t>
+      </w:r>
+    </w:p>
+    <w:p>
+      <w:pPr>
+        <w:rPr>
+          <w:lang w:val="en-US"/>
+        </w:rPr>
+      </w:pPr>
+      <w:bookmarkStart w:id="246" w:name="_Tag_USER_DATA_FILE"/>
+      <w:bookmarkEnd w:id="246"/>
+    </w:p>
+    <w:p>
+      <w:pPr>
+        <w:pStyle w:val="Titre3"/>
+      </w:pPr>
+      <w:bookmarkStart w:id="247" w:name="_Toc456106033"/>
+      <w:r>
+        <w:t>Tag USER_DATA_FILE</w:t>
+      </w:r>
+      <w:bookmarkEnd w:id="247"/>
+    </w:p>
+    <w:p>
+      <w:pPr>
+        <w:rPr>
+          <w:lang w:val="en-US"/>
+        </w:rPr>
+      </w:pPr>
+      <w:r>
+        <w:rPr>
+          <w:lang w:val="en-US"/>
+        </w:rPr>
+        <w:t>This tag is used to indicate the path and the name to access the user data file. It can be an absolute path or a relative path. In case of relative path, the path where LSPB is invoked is added to the relative path.</w:t>
+      </w:r>
+    </w:p>
+    <w:p>
+      <w:pPr>
+        <w:rPr>
+          <w:lang w:val="en-US"/>
+        </w:rPr>
+      </w:pPr>
+      <w:r>
+        <w:rPr>
+          <w:lang w:val="en-US"/>
+        </w:rPr>
+        <w:t>This tag is not mandatory.</w:t>
+      </w:r>
+    </w:p>
+    <w:p>
+      <w:pPr>
+        <w:rPr>
+          <w:lang w:val="en-US"/>
+        </w:rPr>
+      </w:pPr>
+      <w:ins w:id="248" w:author="Pascal Heude" w:date="2026-08-01T21:20:00Z">
         <w:r>
           <w:rPr>
             <w:b/>
@@ -14538,129 +14551,234 @@
           <w:lastRenderedPageBreak/>
           <w:t>URQT_</w:t>
         </w:r>
-      </w:ins>
-      <w:ins w:id="241" w:author="Pascal Heude" w:date="2026-08-01T22:11:00Z">
         <w:r>
           <w:rPr>
             <w:b/>
             <w:color w:val="0070C0"/>
             <w:lang w:val="en-US"/>
           </w:rPr>
-          <w:t>29</w:t>
+          <w:t>3</w:t>
         </w:r>
       </w:ins>
-      <w:ins w:id="242" w:author="Pascal Heude" w:date="2026-08-01T21:19:00Z">
+      <w:ins w:id="249" w:author="Pascal Heude" w:date="2026-08-01T22:11:00Z">
+        <w:r>
+          <w:rPr>
+            <w:b/>
+            <w:color w:val="0070C0"/>
+            <w:lang w:val="en-US"/>
+          </w:rPr>
+          <w:t>0</w:t>
+        </w:r>
+      </w:ins>
+      <w:ins w:id="250" w:author="Pascal Heude" w:date="2026-08-01T21:20:00Z">
         <w:r>
           <w:rPr>
             <w:lang w:val="en-US"/>
           </w:rPr>
-          <w:t xml:space="preserve">: </w:t>
+          <w:t>: If used, t</w:t>
         </w:r>
       </w:ins>
-      <w:r>
-        <w:rPr>
-          <w:lang w:val="en-US"/>
-        </w:rPr>
-        <w:t xml:space="preserve">The content shall be </w:t>
-      </w:r>
-      <w:r>
-        <w:rPr>
-          <w:lang w:val="en-US"/>
-        </w:rPr>
-        <w:t>the</w:t>
-      </w:r>
-      <w:r>
-        <w:rPr>
-          <w:lang w:val="en-US"/>
-        </w:rPr>
-        <w:t xml:space="preserve"> tag </w:t>
-      </w:r>
-      <w:hyperlink w:anchor="_Tag_USER_DATA_FILE" w:history="1">
+      <w:del w:id="251" w:author="Pascal Heude" w:date="2026-08-01T21:20:00Z">
         <w:r>
           <w:rPr>
-            <w:rStyle w:val="Lienhypertexte"/>
             <w:lang w:val="en-US"/>
           </w:rPr>
-          <w:t>USER_DATA_FILE</w:t>
+          <w:delText>T</w:delText>
         </w:r>
-      </w:hyperlink>
-      <w:r>
-        <w:rPr>
-          <w:lang w:val="en-US"/>
-        </w:rPr>
-        <w:t xml:space="preserve"> or the tag </w:t>
-      </w:r>
-      <w:hyperlink w:anchor="_Tag_USER_DATA_TEXT" w:history="1">
+      </w:del>
+      <w:r>
+        <w:rPr>
+          <w:lang w:val="en-US"/>
+        </w:rPr>
+        <w:t xml:space="preserve">he content shall be </w:t>
+      </w:r>
+      <w:ins w:id="252" w:author="Pascal Heude" w:date="2026-08-01T21:20:00Z">
         <w:r>
           <w:rPr>
-            <w:rStyle w:val="Lienhypertexte"/>
             <w:lang w:val="en-US"/>
           </w:rPr>
-          <w:t>USER_DATA_TEXT</w:t>
+          <w:t>a readable filename, including or not a path, absolute or relative.</w:t>
         </w:r>
-      </w:hyperlink>
-      <w:r>
-        <w:rPr>
-          <w:lang w:val="en-US"/>
-        </w:rPr>
-        <w:t>.</w:t>
-      </w:r>
-    </w:p>
-    <w:p>
-      <w:pPr>
-        <w:rPr>
-          <w:lang w:val="en-US"/>
-        </w:rPr>
-      </w:pPr>
-      <w:r>
-        <w:rPr>
-          <w:lang w:val="en-US"/>
-        </w:rPr>
-        <w:t xml:space="preserve">This tag is </w:t>
-      </w:r>
-      <w:r>
-        <w:rPr>
-          <w:lang w:val="en-US"/>
-        </w:rPr>
-        <w:t xml:space="preserve">not </w:t>
-      </w:r>
-      <w:r>
-        <w:rPr>
-          <w:lang w:val="en-US"/>
-        </w:rPr>
-        <w:t>mandatory.</w:t>
-      </w:r>
-    </w:p>
-    <w:p>
-      <w:pPr>
-        <w:rPr>
-          <w:lang w:val="en-US"/>
-        </w:rPr>
-      </w:pPr>
-      <w:bookmarkStart w:id="243" w:name="_Tag_USER_DATA_FILE"/>
-      <w:bookmarkEnd w:id="243"/>
+      </w:ins>
+      <w:del w:id="253" w:author="Pascal Heude" w:date="2026-08-01T21:20:00Z">
+        <w:r>
+          <w:rPr>
+            <w:lang w:val="en-US"/>
+          </w:rPr>
+          <w:delText>a list of characters</w:delText>
+        </w:r>
+      </w:del>
+      <w:r>
+        <w:rPr>
+          <w:lang w:val="en-US"/>
+        </w:rPr>
+        <w:t>. If the file is not readable, LSPB will generate an exception. The content of the file is written to the header file in user defined data field (see ref [3] §</w:t>
+      </w:r>
+      <w:r>
+        <w:rPr>
+          <w:lang w:val="en-US"/>
+        </w:rPr>
+        <w:t>2.2.3.1.57</w:t>
+      </w:r>
+      <w:r>
+        <w:rPr>
+          <w:lang w:val="en-US"/>
+        </w:rPr>
+        <w:t>).</w:t>
+      </w:r>
+    </w:p>
+    <w:p>
+      <w:pPr>
+        <w:rPr>
+          <w:lang w:val="en-US"/>
+        </w:rPr>
+      </w:pPr>
+    </w:p>
+    <w:p>
+      <w:pPr>
+        <w:rPr>
+          <w:lang w:val="en-US"/>
+        </w:rPr>
+      </w:pPr>
+      <w:r>
+        <w:rPr>
+          <w:u w:val="single"/>
+          <w:lang w:val="en-US"/>
+        </w:rPr>
+        <w:t>Example</w:t>
+      </w:r>
+      <w:r>
+        <w:rPr>
+          <w:u w:val="single"/>
+          <w:lang w:val="en-US"/>
+        </w:rPr>
+        <w:t>s</w:t>
+      </w:r>
+      <w:r>
+        <w:rPr>
+          <w:lang w:val="en-US"/>
+        </w:rPr>
+        <w:t>:</w:t>
+      </w:r>
+    </w:p>
+    <w:p>
+      <w:pPr>
+        <w:rPr>
+          <w:lang w:val="en-US"/>
+        </w:rPr>
+      </w:pPr>
+      <w:r>
+        <w:rPr>
+          <w:lang w:val="en-US"/>
+        </w:rPr>
+        <w:t>&lt;</w:t>
+      </w:r>
+      <w:r>
+        <w:rPr>
+          <w:lang w:val="en-US"/>
+        </w:rPr>
+        <w:t>USER_DATA_FILE</w:t>
+      </w:r>
+      <w:r>
+        <w:rPr>
+          <w:lang w:val="en-US"/>
+        </w:rPr>
+        <w:t>&gt;c:\temp\user_data.txt&lt;/</w:t>
+      </w:r>
+      <w:r>
+        <w:rPr>
+          <w:lang w:val="en-US"/>
+        </w:rPr>
+        <w:t>USER_DATA_FILE</w:t>
+      </w:r>
+      <w:r>
+        <w:rPr>
+          <w:lang w:val="en-US"/>
+        </w:rPr>
+        <w:t>&gt;</w:t>
+      </w:r>
+      <w:r>
+        <w:rPr>
+          <w:rStyle w:val="Appelnotedebasdep"/>
+          <w:lang w:val="en-US"/>
+        </w:rPr>
+        <w:footnoteReference w:id="7"/>
+      </w:r>
+    </w:p>
+    <w:p>
+      <w:pPr>
+        <w:rPr>
+          <w:lang w:val="en-US"/>
+        </w:rPr>
+      </w:pPr>
+      <w:r>
+        <w:rPr>
+          <w:lang w:val="en-US"/>
+        </w:rPr>
+        <w:t>&lt;</w:t>
+      </w:r>
+      <w:r>
+        <w:rPr>
+          <w:lang w:val="en-US"/>
+        </w:rPr>
+        <w:t>USER_DATA_FILE</w:t>
+      </w:r>
+      <w:r>
+        <w:rPr>
+          <w:lang w:val="en-US"/>
+        </w:rPr>
+        <w:t>&gt;user_data.bin&lt;/</w:t>
+      </w:r>
+      <w:r>
+        <w:rPr>
+          <w:lang w:val="en-US"/>
+        </w:rPr>
+        <w:t>USER_DATA_FILE</w:t>
+      </w:r>
+      <w:r>
+        <w:rPr>
+          <w:lang w:val="en-US"/>
+        </w:rPr>
+        <w:t>&gt;</w:t>
+      </w:r>
+      <w:r>
+        <w:rPr>
+          <w:rStyle w:val="Appelnotedebasdep"/>
+          <w:lang w:val="en-US"/>
+        </w:rPr>
+        <w:footnoteReference w:id="8"/>
+      </w:r>
+    </w:p>
+    <w:p>
+      <w:pPr>
+        <w:rPr>
+          <w:lang w:val="en-US"/>
+        </w:rPr>
+      </w:pPr>
     </w:p>
     <w:p>
       <w:pPr>
         <w:pStyle w:val="Titre3"/>
       </w:pPr>
-      <w:bookmarkStart w:id="244" w:name="_Toc456106033"/>
-      <w:r>
-        <w:t>Tag USER_DATA_FILE</w:t>
-      </w:r>
-      <w:bookmarkEnd w:id="244"/>
-    </w:p>
-    <w:p>
-      <w:pPr>
-        <w:rPr>
-          <w:lang w:val="en-US"/>
-        </w:rPr>
-      </w:pPr>
-      <w:r>
-        <w:rPr>
-          <w:lang w:val="en-US"/>
-        </w:rPr>
-        <w:t>This tag is used to indicate the path and the name to access the user data file. It can be an absolute path or a relative path. In case of relative path, the path where LSPB is invoked is added to the relative path.</w:t>
+      <w:bookmarkStart w:id="254" w:name="_Tag_USER_DATA_TEXT"/>
+      <w:bookmarkStart w:id="255" w:name="_Toc456106034"/>
+      <w:bookmarkEnd w:id="254"/>
+      <w:r>
+        <w:t>Tag USER_DATA_TEXT</w:t>
+      </w:r>
+      <w:bookmarkEnd w:id="255"/>
+    </w:p>
+    <w:p>
+      <w:pPr>
+        <w:rPr>
+          <w:lang w:val="en-US"/>
+        </w:rPr>
+      </w:pPr>
+      <w:r>
+        <w:rPr>
+          <w:lang w:val="en-US"/>
+        </w:rPr>
+        <w:t>This tag is used to indicate text.</w:t>
       </w:r>
     </w:p>
     <w:p>
@@ -14682,7 +14800,7 @@
           <w:lang w:val="en-US"/>
         </w:rPr>
       </w:pPr>
-      <w:ins w:id="245" w:author="Pascal Heude" w:date="2026-08-01T21:20:00Z">
+      <w:ins w:id="256" w:author="Pascal Heude" w:date="2026-08-01T21:21:00Z">
         <w:r>
           <w:rPr>
             <w:b/>
@@ -14700,285 +14818,7 @@
           <w:t>3</w:t>
         </w:r>
       </w:ins>
-      <w:ins w:id="246" w:author="Pascal Heude" w:date="2026-08-01T22:11:00Z">
-        <w:r>
-          <w:rPr>
-            <w:b/>
-            <w:color w:val="0070C0"/>
-            <w:lang w:val="en-US"/>
-          </w:rPr>
-          <w:t>0</w:t>
-        </w:r>
-      </w:ins>
-      <w:ins w:id="247" w:author="Pascal Heude" w:date="2026-08-01T21:20:00Z">
-        <w:r>
-          <w:rPr>
-            <w:lang w:val="en-US"/>
-          </w:rPr>
-          <w:t xml:space="preserve">: </w:t>
-        </w:r>
-        <w:r>
-          <w:rPr>
-            <w:lang w:val="en-US"/>
-          </w:rPr>
-          <w:t>If used, t</w:t>
-        </w:r>
-      </w:ins>
-      <w:del w:id="248" w:author="Pascal Heude" w:date="2026-08-01T21:20:00Z">
-        <w:r>
-          <w:rPr>
-            <w:lang w:val="en-US"/>
-          </w:rPr>
-          <w:delText>T</w:delText>
-        </w:r>
-      </w:del>
-      <w:r>
-        <w:rPr>
-          <w:lang w:val="en-US"/>
-        </w:rPr>
-        <w:t xml:space="preserve">he content shall be </w:t>
-      </w:r>
-      <w:ins w:id="249" w:author="Pascal Heude" w:date="2026-08-01T21:20:00Z">
-        <w:r>
-          <w:rPr>
-            <w:lang w:val="en-US"/>
-          </w:rPr>
-          <w:t>a readable filename, including or not a path, absolute or relative.</w:t>
-        </w:r>
-      </w:ins>
-      <w:del w:id="250" w:author="Pascal Heude" w:date="2026-08-01T21:20:00Z">
-        <w:r>
-          <w:rPr>
-            <w:lang w:val="en-US"/>
-          </w:rPr>
-          <w:delText>a list of characters</w:delText>
-        </w:r>
-      </w:del>
-      <w:r>
-        <w:rPr>
-          <w:lang w:val="en-US"/>
-        </w:rPr>
-        <w:t>. If the file is not readable, LSPB will generate an exception. The content of the file is written to the header file in user defined data field (see ref [3] §</w:t>
-      </w:r>
-      <w:r>
-        <w:rPr>
-          <w:lang w:val="en-US"/>
-        </w:rPr>
-        <w:t>2.2.3.1.57</w:t>
-      </w:r>
-      <w:r>
-        <w:rPr>
-          <w:lang w:val="en-US"/>
-        </w:rPr>
-        <w:t>).</w:t>
-      </w:r>
-    </w:p>
-    <w:p>
-      <w:pPr>
-        <w:rPr>
-          <w:lang w:val="en-US"/>
-        </w:rPr>
-      </w:pPr>
-    </w:p>
-    <w:p>
-      <w:pPr>
-        <w:rPr>
-          <w:lang w:val="en-US"/>
-        </w:rPr>
-      </w:pPr>
-      <w:r>
-        <w:rPr>
-          <w:u w:val="single"/>
-          <w:lang w:val="en-US"/>
-        </w:rPr>
-        <w:t>Example</w:t>
-      </w:r>
-      <w:r>
-        <w:rPr>
-          <w:u w:val="single"/>
-          <w:lang w:val="en-US"/>
-        </w:rPr>
-        <w:t>s</w:t>
-      </w:r>
-      <w:r>
-        <w:rPr>
-          <w:lang w:val="en-US"/>
-        </w:rPr>
-        <w:t>:</w:t>
-      </w:r>
-    </w:p>
-    <w:p>
-      <w:pPr>
-        <w:rPr>
-          <w:lang w:val="en-US"/>
-        </w:rPr>
-      </w:pPr>
-      <w:r>
-        <w:rPr>
-          <w:lang w:val="en-US"/>
-        </w:rPr>
-        <w:t>&lt;</w:t>
-      </w:r>
-      <w:r>
-        <w:rPr>
-          <w:lang w:val="en-US"/>
-        </w:rPr>
-        <w:t>USER_DATA_FILE</w:t>
-      </w:r>
-      <w:r>
-        <w:rPr>
-          <w:lang w:val="en-US"/>
-        </w:rPr>
-        <w:t>&gt;c:\temp\user_data.txt&lt;/</w:t>
-      </w:r>
-      <w:r>
-        <w:rPr>
-          <w:lang w:val="en-US"/>
-        </w:rPr>
-        <w:t>USER_DATA_FILE</w:t>
-      </w:r>
-      <w:r>
-        <w:rPr>
-          <w:lang w:val="en-US"/>
-        </w:rPr>
-        <w:t>&gt;</w:t>
-      </w:r>
-      <w:r>
-        <w:rPr>
-          <w:rStyle w:val="Appelnotedebasdep"/>
-          <w:lang w:val="en-US"/>
-        </w:rPr>
-        <w:footnoteReference w:id="7"/>
-      </w:r>
-    </w:p>
-    <w:p>
-      <w:pPr>
-        <w:rPr>
-          <w:lang w:val="en-US"/>
-        </w:rPr>
-      </w:pPr>
-      <w:r>
-        <w:rPr>
-          <w:lang w:val="en-US"/>
-        </w:rPr>
-        <w:t>&lt;</w:t>
-      </w:r>
-      <w:r>
-        <w:rPr>
-          <w:lang w:val="en-US"/>
-        </w:rPr>
-        <w:t>USER_DATA_FILE</w:t>
-      </w:r>
-      <w:r>
-        <w:rPr>
-          <w:lang w:val="en-US"/>
-        </w:rPr>
-        <w:t>&gt;</w:t>
-      </w:r>
-      <w:proofErr w:type="spellStart"/>
-      <w:r>
-        <w:rPr>
-          <w:lang w:val="en-US"/>
-        </w:rPr>
-        <w:t>user_data.bin</w:t>
-      </w:r>
-      <w:proofErr w:type="spellEnd"/>
-      <w:r>
-        <w:rPr>
-          <w:lang w:val="en-US"/>
-        </w:rPr>
-        <w:t>&lt;/</w:t>
-      </w:r>
-      <w:r>
-        <w:rPr>
-          <w:lang w:val="en-US"/>
-        </w:rPr>
-        <w:t>USER_DATA_FILE</w:t>
-      </w:r>
-      <w:r>
-        <w:rPr>
-          <w:lang w:val="en-US"/>
-        </w:rPr>
-        <w:t>&gt;</w:t>
-      </w:r>
-      <w:r>
-        <w:rPr>
-          <w:rStyle w:val="Appelnotedebasdep"/>
-          <w:lang w:val="en-US"/>
-        </w:rPr>
-        <w:footnoteReference w:id="8"/>
-      </w:r>
-    </w:p>
-    <w:p>
-      <w:pPr>
-        <w:rPr>
-          <w:lang w:val="en-US"/>
-        </w:rPr>
-      </w:pPr>
-    </w:p>
-    <w:p>
-      <w:pPr>
-        <w:pStyle w:val="Titre3"/>
-      </w:pPr>
-      <w:bookmarkStart w:id="251" w:name="_Tag_USER_DATA_TEXT"/>
-      <w:bookmarkStart w:id="252" w:name="_Toc456106034"/>
-      <w:bookmarkEnd w:id="251"/>
-      <w:r>
-        <w:t>Tag USER_DATA_TEXT</w:t>
-      </w:r>
-      <w:bookmarkEnd w:id="252"/>
-    </w:p>
-    <w:p>
-      <w:pPr>
-        <w:rPr>
-          <w:lang w:val="en-US"/>
-        </w:rPr>
-      </w:pPr>
-      <w:r>
-        <w:rPr>
-          <w:lang w:val="en-US"/>
-        </w:rPr>
-        <w:t>This tag is used to indicate text.</w:t>
-      </w:r>
-    </w:p>
-    <w:p>
-      <w:pPr>
-        <w:rPr>
-          <w:lang w:val="en-US"/>
-        </w:rPr>
-      </w:pPr>
-      <w:r>
-        <w:rPr>
-          <w:lang w:val="en-US"/>
-        </w:rPr>
-        <w:t>This tag is not mandatory.</w:t>
-      </w:r>
-    </w:p>
-    <w:p>
-      <w:pPr>
-        <w:rPr>
-          <w:lang w:val="en-US"/>
-        </w:rPr>
-      </w:pPr>
-      <w:ins w:id="253" w:author="Pascal Heude" w:date="2026-08-01T21:21:00Z">
-        <w:r>
-          <w:rPr>
-            <w:b/>
-            <w:color w:val="0070C0"/>
-            <w:lang w:val="en-US"/>
-          </w:rPr>
-          <w:t>URQT_</w:t>
-        </w:r>
-        <w:r>
-          <w:rPr>
-            <w:b/>
-            <w:color w:val="0070C0"/>
-            <w:lang w:val="en-US"/>
-          </w:rPr>
-          <w:t>3</w:t>
-        </w:r>
-      </w:ins>
-      <w:ins w:id="254" w:author="Pascal Heude" w:date="2026-08-01T22:11:00Z">
+      <w:ins w:id="257" w:author="Pascal Heude" w:date="2026-08-01T22:11:00Z">
         <w:r>
           <w:rPr>
             <w:b/>
@@ -14988,23 +14828,15 @@
           <w:t>1</w:t>
         </w:r>
       </w:ins>
-      <w:bookmarkStart w:id="255" w:name="_GoBack"/>
-      <w:bookmarkEnd w:id="255"/>
-      <w:ins w:id="256" w:author="Pascal Heude" w:date="2026-08-01T21:21:00Z">
+      <w:ins w:id="258" w:author="Pascal Heude" w:date="2026-08-01T21:21:00Z">
         <w:r>
           <w:rPr>
             <w:lang w:val="en-US"/>
           </w:rPr>
-          <w:t xml:space="preserve">: </w:t>
-        </w:r>
-        <w:r>
-          <w:rPr>
-            <w:lang w:val="en-US"/>
-          </w:rPr>
-          <w:t xml:space="preserve">If used, </w:t>
+          <w:t xml:space="preserve">: If used, </w:t>
         </w:r>
       </w:ins>
-      <w:del w:id="257" w:author="Pascal Heude" w:date="2026-08-01T21:21:00Z">
+      <w:del w:id="259" w:author="Pascal Heude" w:date="2026-08-01T21:21:00Z">
         <w:r>
           <w:rPr>
             <w:lang w:val="en-US"/>
@@ -15012,7 +14844,7 @@
           <w:delText>T</w:delText>
         </w:r>
       </w:del>
-      <w:ins w:id="258" w:author="Pascal Heude" w:date="2026-08-01T21:21:00Z">
+      <w:ins w:id="260" w:author="Pascal Heude" w:date="2026-08-01T21:21:00Z">
         <w:r>
           <w:rPr>
             <w:lang w:val="en-US"/>
@@ -15076,21 +14908,7 @@
         <w:rPr>
           <w:lang w:val="en-US"/>
         </w:rPr>
-        <w:t>&lt;USER_DATA_TEXT&gt;</w:t>
-      </w:r>
-      <w:proofErr w:type="gramStart"/>
-      <w:r>
-        <w:rPr>
-          <w:lang w:val="en-US"/>
-        </w:rPr>
-        <w:t>This</w:t>
-      </w:r>
-      <w:proofErr w:type="gramEnd"/>
-      <w:r>
-        <w:rPr>
-          <w:lang w:val="en-US"/>
-        </w:rPr>
-        <w:t xml:space="preserve"> is a text&lt;/USER_DATA_TEXT&gt;</w:t>
+        <w:t>&lt;USER_DATA_TEXT&gt;This is a text&lt;/USER_DATA_TEXT&gt;</w:t>
       </w:r>
     </w:p>
     <w:p>
@@ -15104,11 +14922,11 @@
       <w:pPr>
         <w:pStyle w:val="Titre3"/>
       </w:pPr>
-      <w:bookmarkStart w:id="259" w:name="_Toc456106035"/>
+      <w:bookmarkStart w:id="261" w:name="_Toc456106035"/>
       <w:r>
         <w:t>Tag USER_DATA_BCC</w:t>
       </w:r>
-      <w:bookmarkEnd w:id="259"/>
+      <w:bookmarkEnd w:id="261"/>
     </w:p>
     <w:p>
       <w:pPr>
@@ -15148,13 +14966,13 @@
       <w:pPr>
         <w:pStyle w:val="Titre3"/>
       </w:pPr>
-      <w:bookmarkStart w:id="260" w:name="_Tag_MEDIA"/>
-      <w:bookmarkStart w:id="261" w:name="_Toc456106036"/>
-      <w:bookmarkEnd w:id="260"/>
+      <w:bookmarkStart w:id="262" w:name="_Tag_MEDIA"/>
+      <w:bookmarkStart w:id="263" w:name="_Toc456106036"/>
+      <w:bookmarkEnd w:id="262"/>
       <w:r>
         <w:t>Tag MEDIA</w:t>
       </w:r>
-      <w:bookmarkEnd w:id="261"/>
+      <w:bookmarkEnd w:id="263"/>
     </w:p>
     <w:p>
       <w:pPr>
@@ -15289,14 +15107,14 @@
           <w:lang w:val="en-US"/>
         </w:rPr>
       </w:pPr>
-      <w:bookmarkStart w:id="262" w:name="_Toc456106037"/>
+      <w:bookmarkStart w:id="264" w:name="_Toc456106037"/>
       <w:r>
         <w:rPr>
           <w:lang w:val="en-US"/>
         </w:rPr>
         <w:t>LIMITATIONS</w:t>
       </w:r>
-      <w:bookmarkEnd w:id="262"/>
+      <w:bookmarkEnd w:id="264"/>
     </w:p>
     <w:p>
       <w:pPr>
@@ -15322,23 +15140,22 @@
       <w:pPr>
         <w:pStyle w:val="Titre2"/>
       </w:pPr>
-      <w:bookmarkStart w:id="263" w:name="_Toc456106038"/>
+      <w:bookmarkStart w:id="265" w:name="_Toc456106038"/>
       <w:r>
         <w:t>ARINC665-1</w:t>
       </w:r>
-      <w:bookmarkEnd w:id="263"/>
-    </w:p>
-    <w:p>
-      <w:pPr>
-        <w:rPr>
-          <w:lang w:val="en-US"/>
-        </w:rPr>
-      </w:pPr>
-      <w:r>
-        <w:rPr>
-          <w:lang w:val="en-US"/>
-        </w:rPr>
-        <w:lastRenderedPageBreak/>
+      <w:bookmarkEnd w:id="265"/>
+    </w:p>
+    <w:p>
+      <w:pPr>
+        <w:rPr>
+          <w:lang w:val="en-US"/>
+        </w:rPr>
+      </w:pPr>
+      <w:r>
+        <w:rPr>
+          <w:lang w:val="en-US"/>
+        </w:rPr>
         <w:t>This r</w:t>
       </w:r>
       <w:r>
@@ -15389,21 +15206,21 @@
       <w:pPr>
         <w:pStyle w:val="Titre2"/>
       </w:pPr>
-      <w:bookmarkStart w:id="264" w:name="_Toc456106039"/>
+      <w:bookmarkStart w:id="266" w:name="_Toc456106039"/>
       <w:r>
         <w:t>ARINC665-2</w:t>
       </w:r>
-      <w:bookmarkEnd w:id="264"/>
+      <w:bookmarkEnd w:id="266"/>
     </w:p>
     <w:p>
       <w:pPr>
         <w:pStyle w:val="Titre3"/>
       </w:pPr>
-      <w:bookmarkStart w:id="265" w:name="_Toc456106040"/>
+      <w:bookmarkStart w:id="267" w:name="_Toc456106040"/>
       <w:r>
         <w:t>General</w:t>
       </w:r>
-      <w:bookmarkEnd w:id="265"/>
+      <w:bookmarkEnd w:id="267"/>
     </w:p>
     <w:p>
       <w:pPr>
@@ -15444,6 +15261,7 @@
         <w:rPr>
           <w:lang w:val="en-US"/>
         </w:rPr>
+        <w:lastRenderedPageBreak/>
         <w:t>It’s not possible to have several integrity checks in case of several support files.</w:t>
       </w:r>
       <w:r>
@@ -15464,16 +15282,11 @@
       <w:pPr>
         <w:pStyle w:val="Titre3"/>
       </w:pPr>
-      <w:bookmarkStart w:id="266" w:name="_Toc456106041"/>
-      <w:r>
-        <w:t xml:space="preserve">Data </w:t>
-      </w:r>
-      <w:proofErr w:type="spellStart"/>
-      <w:r>
-        <w:t>files</w:t>
-      </w:r>
-      <w:bookmarkEnd w:id="266"/>
-      <w:proofErr w:type="spellEnd"/>
+      <w:bookmarkStart w:id="268" w:name="_Toc456106041"/>
+      <w:r>
+        <w:t>Data files</w:t>
+      </w:r>
+      <w:bookmarkEnd w:id="268"/>
     </w:p>
     <w:p>
       <w:pPr>
@@ -15511,27 +15324,14 @@
       <w:pPr>
         <w:pStyle w:val="Titre3"/>
       </w:pPr>
-      <w:bookmarkStart w:id="267" w:name="_Toc456106042"/>
+      <w:bookmarkStart w:id="269" w:name="_Toc456106042"/>
       <w:r>
         <w:t>List</w:t>
       </w:r>
       <w:r>
-        <w:t>-</w:t>
-      </w:r>
-      <w:proofErr w:type="spellStart"/>
-      <w:r>
-        <w:t>of</w:t>
-      </w:r>
-      <w:proofErr w:type="spellEnd"/>
-      <w:r>
-        <w:t xml:space="preserve">-Files </w:t>
-      </w:r>
-      <w:proofErr w:type="spellStart"/>
-      <w:r>
-        <w:t>file</w:t>
-      </w:r>
-      <w:bookmarkEnd w:id="267"/>
-      <w:proofErr w:type="spellEnd"/>
+        <w:t>-of-Files file</w:t>
+      </w:r>
+      <w:bookmarkEnd w:id="269"/>
     </w:p>
     <w:p>
       <w:pPr>
@@ -15610,24 +15410,11 @@
       <w:pPr>
         <w:pStyle w:val="Titre3"/>
       </w:pPr>
-      <w:bookmarkStart w:id="268" w:name="_Toc456106043"/>
-      <w:r>
-        <w:t>List-</w:t>
-      </w:r>
-      <w:proofErr w:type="spellStart"/>
-      <w:r>
-        <w:t>of</w:t>
-      </w:r>
-      <w:proofErr w:type="spellEnd"/>
-      <w:r>
-        <w:t xml:space="preserve">-Loads </w:t>
-      </w:r>
-      <w:proofErr w:type="spellStart"/>
-      <w:r>
-        <w:t>file</w:t>
-      </w:r>
-      <w:bookmarkEnd w:id="268"/>
-      <w:proofErr w:type="spellEnd"/>
+      <w:bookmarkStart w:id="270" w:name="_Toc456106043"/>
+      <w:r>
+        <w:t>List-of-Loads file</w:t>
+      </w:r>
+      <w:bookmarkEnd w:id="270"/>
     </w:p>
     <w:p>
       <w:pPr>
@@ -15718,24 +15505,11 @@
       <w:pPr>
         <w:pStyle w:val="Titre3"/>
       </w:pPr>
-      <w:bookmarkStart w:id="269" w:name="_Toc456106044"/>
-      <w:r>
-        <w:t>List-</w:t>
-      </w:r>
-      <w:proofErr w:type="spellStart"/>
-      <w:r>
-        <w:t>of</w:t>
-      </w:r>
-      <w:proofErr w:type="spellEnd"/>
-      <w:r>
-        <w:t xml:space="preserve">-Batch </w:t>
-      </w:r>
-      <w:proofErr w:type="spellStart"/>
-      <w:r>
-        <w:t>file</w:t>
-      </w:r>
-      <w:bookmarkEnd w:id="269"/>
-      <w:proofErr w:type="spellEnd"/>
+      <w:bookmarkStart w:id="271" w:name="_Toc456106044"/>
+      <w:r>
+        <w:t>List-of-Batch file</w:t>
+      </w:r>
+      <w:bookmarkEnd w:id="271"/>
     </w:p>
     <w:p>
       <w:pPr>
@@ -15904,16 +15678,11 @@
       <w:pPr>
         <w:pStyle w:val="Titre3"/>
       </w:pPr>
-      <w:bookmarkStart w:id="270" w:name="_Toc456106045"/>
-      <w:r>
-        <w:t xml:space="preserve">Batch </w:t>
-      </w:r>
-      <w:proofErr w:type="spellStart"/>
-      <w:r>
-        <w:t>file</w:t>
-      </w:r>
-      <w:bookmarkEnd w:id="270"/>
-      <w:proofErr w:type="spellEnd"/>
+      <w:bookmarkStart w:id="272" w:name="_Toc456106045"/>
+      <w:r>
+        <w:t>Batch file</w:t>
+      </w:r>
+      <w:bookmarkEnd w:id="272"/>
     </w:p>
     <w:p>
       <w:pPr>
@@ -15954,21 +15723,21 @@
       <w:pPr>
         <w:pStyle w:val="Titre2"/>
       </w:pPr>
-      <w:bookmarkStart w:id="271" w:name="_Toc456106046"/>
+      <w:bookmarkStart w:id="273" w:name="_Toc456106046"/>
       <w:r>
         <w:t>ARINC665-3</w:t>
       </w:r>
-      <w:bookmarkEnd w:id="271"/>
+      <w:bookmarkEnd w:id="273"/>
     </w:p>
     <w:p>
       <w:pPr>
         <w:pStyle w:val="Titre3"/>
       </w:pPr>
-      <w:bookmarkStart w:id="272" w:name="_Toc456106047"/>
+      <w:bookmarkStart w:id="274" w:name="_Toc456106047"/>
       <w:r>
         <w:t>General</w:t>
       </w:r>
-      <w:bookmarkEnd w:id="272"/>
+      <w:bookmarkEnd w:id="274"/>
     </w:p>
     <w:p>
       <w:pPr>
@@ -16029,16 +15798,11 @@
       <w:pPr>
         <w:pStyle w:val="Titre3"/>
       </w:pPr>
-      <w:bookmarkStart w:id="273" w:name="_Toc456106048"/>
-      <w:r>
-        <w:t xml:space="preserve">Header </w:t>
-      </w:r>
-      <w:proofErr w:type="spellStart"/>
-      <w:r>
-        <w:t>file</w:t>
-      </w:r>
-      <w:bookmarkEnd w:id="273"/>
-      <w:proofErr w:type="spellEnd"/>
+      <w:bookmarkStart w:id="275" w:name="_Toc456106048"/>
+      <w:r>
+        <w:t>Header file</w:t>
+      </w:r>
+      <w:bookmarkEnd w:id="275"/>
     </w:p>
     <w:p>
       <w:pPr>
@@ -16073,7 +15837,6 @@
         <w:rPr>
           <w:lang w:val="en-US"/>
         </w:rPr>
-        <w:lastRenderedPageBreak/>
         <w:t>Integrity check of load (see ref [3] §</w:t>
       </w:r>
       <w:r>
@@ -16148,16 +15911,11 @@
       <w:pPr>
         <w:pStyle w:val="Titre3"/>
       </w:pPr>
-      <w:bookmarkStart w:id="274" w:name="_Toc456106049"/>
-      <w:r>
-        <w:t xml:space="preserve">Data </w:t>
-      </w:r>
-      <w:proofErr w:type="spellStart"/>
-      <w:r>
-        <w:t>files</w:t>
-      </w:r>
-      <w:bookmarkEnd w:id="274"/>
-      <w:proofErr w:type="spellEnd"/>
+      <w:bookmarkStart w:id="276" w:name="_Toc456106049"/>
+      <w:r>
+        <w:t>Data files</w:t>
+      </w:r>
+      <w:bookmarkEnd w:id="276"/>
     </w:p>
     <w:p>
       <w:pPr>
@@ -16213,27 +15971,14 @@
       <w:pPr>
         <w:pStyle w:val="Titre3"/>
       </w:pPr>
-      <w:bookmarkStart w:id="275" w:name="_Toc456106050"/>
+      <w:bookmarkStart w:id="277" w:name="_Toc456106050"/>
       <w:r>
         <w:t>List</w:t>
       </w:r>
       <w:r>
-        <w:t>-</w:t>
-      </w:r>
-      <w:proofErr w:type="spellStart"/>
-      <w:r>
-        <w:t>of</w:t>
-      </w:r>
-      <w:proofErr w:type="spellEnd"/>
-      <w:r>
-        <w:t xml:space="preserve">-Files </w:t>
-      </w:r>
-      <w:proofErr w:type="spellStart"/>
-      <w:r>
-        <w:t>file</w:t>
-      </w:r>
-      <w:bookmarkEnd w:id="275"/>
-      <w:proofErr w:type="spellEnd"/>
+        <w:t>-of-Files file</w:t>
+      </w:r>
+      <w:bookmarkEnd w:id="277"/>
     </w:p>
     <w:p>
       <w:pPr>
@@ -16408,24 +16153,11 @@
       <w:pPr>
         <w:pStyle w:val="Titre3"/>
       </w:pPr>
-      <w:bookmarkStart w:id="276" w:name="_Toc456106051"/>
-      <w:r>
-        <w:t>List-</w:t>
-      </w:r>
-      <w:proofErr w:type="spellStart"/>
-      <w:r>
-        <w:t>of</w:t>
-      </w:r>
-      <w:proofErr w:type="spellEnd"/>
-      <w:r>
-        <w:t xml:space="preserve">-Loads </w:t>
-      </w:r>
-      <w:proofErr w:type="spellStart"/>
-      <w:r>
-        <w:t>file</w:t>
-      </w:r>
-      <w:bookmarkEnd w:id="276"/>
-      <w:proofErr w:type="spellEnd"/>
+      <w:bookmarkStart w:id="278" w:name="_Toc456106051"/>
+      <w:r>
+        <w:t>List-of-Loads file</w:t>
+      </w:r>
+      <w:bookmarkEnd w:id="278"/>
     </w:p>
     <w:p>
       <w:pPr>
@@ -16588,24 +16320,11 @@
       <w:pPr>
         <w:pStyle w:val="Titre3"/>
       </w:pPr>
-      <w:bookmarkStart w:id="277" w:name="_Toc456106052"/>
-      <w:r>
-        <w:t>List-</w:t>
-      </w:r>
-      <w:proofErr w:type="spellStart"/>
-      <w:r>
-        <w:t>of</w:t>
-      </w:r>
-      <w:proofErr w:type="spellEnd"/>
-      <w:r>
-        <w:t xml:space="preserve">-Batch </w:t>
-      </w:r>
-      <w:proofErr w:type="spellStart"/>
-      <w:r>
-        <w:t>file</w:t>
-      </w:r>
-      <w:bookmarkEnd w:id="277"/>
-      <w:proofErr w:type="spellEnd"/>
+      <w:bookmarkStart w:id="279" w:name="_Toc456106052"/>
+      <w:r>
+        <w:t>List-of-Batch file</w:t>
+      </w:r>
+      <w:bookmarkEnd w:id="279"/>
     </w:p>
     <w:p>
       <w:pPr>
@@ -16732,16 +16451,11 @@
       <w:pPr>
         <w:pStyle w:val="Titre3"/>
       </w:pPr>
-      <w:bookmarkStart w:id="278" w:name="_Toc456106053"/>
-      <w:r>
-        <w:t xml:space="preserve">Batch </w:t>
-      </w:r>
-      <w:proofErr w:type="spellStart"/>
-      <w:r>
-        <w:t>file</w:t>
-      </w:r>
-      <w:bookmarkEnd w:id="278"/>
-      <w:proofErr w:type="spellEnd"/>
+      <w:bookmarkStart w:id="280" w:name="_Toc456106053"/>
+      <w:r>
+        <w:t>Batch file</w:t>
+      </w:r>
+      <w:bookmarkEnd w:id="280"/>
     </w:p>
     <w:p>
       <w:pPr>
@@ -16801,14 +16515,14 @@
           <w:lang w:val="en-US"/>
         </w:rPr>
       </w:pPr>
-      <w:bookmarkStart w:id="279" w:name="_Toc456106054"/>
+      <w:bookmarkStart w:id="281" w:name="_Toc456106054"/>
       <w:r>
         <w:rPr>
           <w:lang w:val="en-US"/>
         </w:rPr>
         <w:t>LOAD STRUCTURE</w:t>
       </w:r>
-      <w:bookmarkEnd w:id="279"/>
+      <w:bookmarkEnd w:id="281"/>
     </w:p>
     <w:p>
       <w:pPr>
@@ -17017,7 +16731,7 @@
           <w:lang w:val="en-US"/>
         </w:rPr>
       </w:pPr>
-      <w:ins w:id="280" w:author="Pascal Heude" w:date="2026-07-30T23:07:00Z">
+      <w:ins w:id="282" w:author="Pascal Heude" w:date="2026-07-30T23:07:00Z">
         <w:r>
           <w:rPr>
             <w:lang w:val="en-US"/>
@@ -17037,27 +16751,21 @@
       <w:pPr>
         <w:pStyle w:val="Titre2"/>
       </w:pPr>
-      <w:bookmarkStart w:id="281" w:name="_Toc456106055"/>
+      <w:bookmarkStart w:id="283" w:name="_Toc456106055"/>
       <w:r>
         <w:t>Filenames</w:t>
       </w:r>
-      <w:bookmarkEnd w:id="281"/>
+      <w:bookmarkEnd w:id="283"/>
     </w:p>
     <w:p>
       <w:pPr>
         <w:pStyle w:val="Titre3"/>
       </w:pPr>
-      <w:bookmarkStart w:id="282" w:name="_Toc456106056"/>
-      <w:r>
-        <w:lastRenderedPageBreak/>
-        <w:t xml:space="preserve">Header </w:t>
-      </w:r>
-      <w:proofErr w:type="spellStart"/>
-      <w:r>
-        <w:t>file</w:t>
-      </w:r>
-      <w:bookmarkEnd w:id="282"/>
-      <w:proofErr w:type="spellEnd"/>
+      <w:bookmarkStart w:id="284" w:name="_Toc456106056"/>
+      <w:r>
+        <w:t>Header file</w:t>
+      </w:r>
+      <w:bookmarkEnd w:id="284"/>
     </w:p>
     <w:p>
       <w:pPr>
@@ -17152,29 +16860,25 @@
       <w:pPr>
         <w:pStyle w:val="Titre3"/>
       </w:pPr>
-      <w:bookmarkStart w:id="283" w:name="_Toc456106057"/>
-      <w:bookmarkStart w:id="284" w:name="_Ref236259785"/>
-      <w:r>
-        <w:t xml:space="preserve">Data </w:t>
-      </w:r>
-      <w:proofErr w:type="spellStart"/>
-      <w:r>
-        <w:t>files</w:t>
-      </w:r>
-      <w:bookmarkEnd w:id="283"/>
-      <w:bookmarkEnd w:id="284"/>
-      <w:proofErr w:type="spellEnd"/>
-    </w:p>
-    <w:p>
-      <w:pPr>
-        <w:rPr>
-          <w:lang w:val="en-US"/>
-        </w:rPr>
-      </w:pPr>
-      <w:r>
-        <w:rPr>
-          <w:lang w:val="en-US"/>
-        </w:rPr>
+      <w:bookmarkStart w:id="285" w:name="_Toc456106057"/>
+      <w:bookmarkStart w:id="286" w:name="_Ref236259785"/>
+      <w:r>
+        <w:t>Data files</w:t>
+      </w:r>
+      <w:bookmarkEnd w:id="285"/>
+      <w:bookmarkEnd w:id="286"/>
+    </w:p>
+    <w:p>
+      <w:pPr>
+        <w:rPr>
+          <w:lang w:val="en-US"/>
+        </w:rPr>
+      </w:pPr>
+      <w:r>
+        <w:rPr>
+          <w:lang w:val="en-US"/>
+        </w:rPr>
+        <w:lastRenderedPageBreak/>
         <w:t>The name of the data files is built</w:t>
       </w:r>
       <w:r>
@@ -17253,16 +16957,11 @@
       <w:pPr>
         <w:pStyle w:val="Titre3"/>
       </w:pPr>
-      <w:bookmarkStart w:id="285" w:name="_Toc456106058"/>
-      <w:r>
-        <w:t xml:space="preserve">Batch </w:t>
-      </w:r>
-      <w:proofErr w:type="spellStart"/>
-      <w:r>
-        <w:t>file</w:t>
-      </w:r>
-      <w:bookmarkEnd w:id="285"/>
-      <w:proofErr w:type="spellEnd"/>
+      <w:bookmarkStart w:id="287" w:name="_Toc456106058"/>
+      <w:r>
+        <w:t>Batch file</w:t>
+      </w:r>
+      <w:bookmarkEnd w:id="287"/>
     </w:p>
     <w:p>
       <w:pPr>
@@ -17401,23 +17100,7 @@
         <w:sz w:val="14"/>
         <w:lang w:val="en-US"/>
       </w:rPr>
-      <w:t xml:space="preserve">This document is the property of Assistance </w:t>
-    </w:r>
-    <w:proofErr w:type="spellStart"/>
-    <w:r>
-      <w:rPr>
-        <w:sz w:val="14"/>
-        <w:lang w:val="en-US"/>
-      </w:rPr>
-      <w:t>Informatique</w:t>
-    </w:r>
-    <w:proofErr w:type="spellEnd"/>
-    <w:r>
-      <w:rPr>
-        <w:sz w:val="14"/>
-        <w:lang w:val="en-US"/>
-      </w:rPr>
-      <w:t xml:space="preserve"> Toulouse and must not be disclosed nor reproduced with</w:t>
+      <w:t>This document is the property of Assistance Informatique Toulouse and must not be disclosed nor reproduced with</w:t>
     </w:r>
     <w:r>
       <w:rPr>
@@ -17444,21 +17127,12 @@
         <w:lang w:val="en-US"/>
       </w:rPr>
     </w:pPr>
-    <w:proofErr w:type="gramStart"/>
     <w:r>
       <w:rPr>
         <w:sz w:val="14"/>
         <w:lang w:val="en-US"/>
       </w:rPr>
-      <w:t>mailto :</w:t>
-    </w:r>
-    <w:proofErr w:type="gramEnd"/>
-    <w:r>
-      <w:rPr>
-        <w:sz w:val="14"/>
-        <w:lang w:val="en-US"/>
-      </w:rPr>
-      <w:t xml:space="preserve"> </w:t>
+      <w:t xml:space="preserve">mailto : </w:t>
     </w:r>
     <w:hyperlink r:id="rId1" w:history="1">
       <w:r>
@@ -17492,7 +17166,7 @@
       <w:rPr>
         <w:noProof/>
       </w:rPr>
-      <w:t>18</w:t>
+      <w:t>12</w:t>
     </w:r>
     <w:r>
       <w:fldChar w:fldCharType="end"/>
@@ -21911,7 +21585,7 @@
 </file>
 
 <file path=customXml/itemProps1.xml><?xml version="1.0" encoding="utf-8"?>
-<ds:datastoreItem xmlns:ds="http://schemas.openxmlformats.org/officeDocument/2006/customXml" ds:itemID="{5F235E04-9821-45D8-83AB-23E79034062E}">
+<ds:datastoreItem xmlns:ds="http://schemas.openxmlformats.org/officeDocument/2006/customXml" ds:itemID="{E1C5E0DB-0D8E-4F17-B81E-2D8DBB8DEEC0}">
   <ds:schemaRefs>
     <ds:schemaRef ds:uri="http://schemas.openxmlformats.org/officeDocument/2006/bibliography"/>
   </ds:schemaRefs>

</xml_diff>